<commit_message>
Restyle technical submittal to Skylance house format
Rebuilt the JYC Marina technical submittal to match the company
template (Marine Structure Rehabilitation reference):

- Real Skylance letterhead: logo + CR banner header, contact-bar
  footer, and faint company watermark (assets cropped from template)
- Cyan (#26B8EF) accent throughout; black section bars with cyan
  left-stripe; cyan sub-headings; branded quantity tables
- Added cover page and table of contents in house style
- SELA shown as Client / Consultant on cover and document control
- Updated both PDF and editable DOCX; brand assets stored in repo

Co-Authored-By: Claude Opus 4.8 <noreply@anthropic.com>
Claude-Session: https://claude.ai/code/session_01EiMwn8BvQ56Xm8AUc8ARZ9
</commit_message>
<xml_diff>
--- a/Technical Submittal - JYC Marina Infrastructure (Skylance).docx
+++ b/Technical Submittal - JYC Marina Infrastructure (Skylance).docx
@@ -2,138 +2,57 @@
 <file path=word/document.xml><?xml version="1.0" encoding="utf-8"?>
 <w:document xmlns:wpc="http://schemas.microsoft.com/office/word/2010/wordprocessingCanvas" xmlns:mo="http://schemas.microsoft.com/office/mac/office/2008/main" xmlns:mc="http://schemas.openxmlformats.org/markup-compatibility/2006" xmlns:mv="urn:schemas-microsoft-com:mac:vml" xmlns:o="urn:schemas-microsoft-com:office:office" xmlns:r="http://schemas.openxmlformats.org/officeDocument/2006/relationships" xmlns:m="http://schemas.openxmlformats.org/officeDocument/2006/math" xmlns:v="urn:schemas-microsoft-com:vml" xmlns:wp14="http://schemas.microsoft.com/office/word/2010/wordprocessingDrawing" xmlns:wp="http://schemas.openxmlformats.org/drawingml/2006/wordprocessingDrawing" xmlns:w10="urn:schemas-microsoft-com:office:word" xmlns:w="http://schemas.openxmlformats.org/wordprocessingml/2006/main" xmlns:w14="http://schemas.microsoft.com/office/word/2010/wordml" xmlns:wpg="http://schemas.microsoft.com/office/word/2010/wordprocessingGroup" xmlns:wpi="http://schemas.microsoft.com/office/word/2010/wordprocessingInk" xmlns:wne="http://schemas.microsoft.com/office/word/2006/wordml" xmlns:wps="http://schemas.microsoft.com/office/word/2010/wordprocessingShape" mc:Ignorable="w14 wp14">
   <w:body>
-    <w:tbl>
-      <w:tblPr>
-        <w:tblW w:type="auto" w:w="0"/>
-        <w:tblLayout w:type="autofit"/>
-        <w:tblLook w:firstColumn="1" w:firstRow="1" w:lastColumn="0" w:lastRow="0" w:noHBand="0" w:noVBand="1" w:val="04A0"/>
-        <w:tblBorders>
-          <w:top w:val="none"/>
-          <w:left w:val="none"/>
-          <w:bottom w:val="none"/>
-          <w:right w:val="none"/>
-          <w:insideH w:val="none"/>
-          <w:insideV w:val="none"/>
-        </w:tblBorders>
-      </w:tblPr>
-      <w:tblGrid>
-        <w:gridCol w:w="4873"/>
-        <w:gridCol w:w="4873"/>
-      </w:tblGrid>
-      <w:tr>
-        <w:tc>
-          <w:tcPr>
-            <w:tcW w:type="dxa" w:w="4873"/>
-          </w:tcPr>
-          <w:p>
-            <w:pPr>
-              <w:jc w:val="left"/>
-            </w:pPr>
-            <w:r>
-              <w:rPr>
-                <w:rFonts w:ascii="Calibri" w:hAnsi="Calibri"/>
-                <w:b/>
-                <w:color w:val="0B1F3A"/>
-                <w:sz w:val="44"/>
-              </w:rPr>
-              <w:t>SELA</w:t>
-            </w:r>
-            <w:r>
-              <w:rPr>
-                <w:color w:val="7A8694"/>
-                <w:sz w:val="16"/>
-              </w:rPr>
-              <w:br/>
-              <w:t>Client / Consultant</w:t>
-            </w:r>
-          </w:p>
-        </w:tc>
-        <w:tc>
-          <w:tcPr>
-            <w:tcW w:type="dxa" w:w="4873"/>
-          </w:tcPr>
-          <w:p>
-            <w:pPr>
-              <w:jc w:val="right"/>
-            </w:pPr>
-            <w:r>
-              <w:rPr>
-                <w:rFonts w:ascii="Calibri" w:hAnsi="Calibri"/>
-                <w:b/>
-                <w:color w:val="1C4E80"/>
-                <w:sz w:val="44"/>
-              </w:rPr>
-              <w:t>SKYLANCE</w:t>
-            </w:r>
-            <w:r>
-              <w:rPr>
-                <w:color w:val="7A8694"/>
-                <w:sz w:val="16"/>
-              </w:rPr>
-              <w:br/>
-              <w:t>Marine Infrastructure Contractor</w:t>
-            </w:r>
-          </w:p>
-        </w:tc>
-      </w:tr>
-    </w:tbl>
     <w:p>
       <w:pPr>
-        <w:spacing w:before="120"/>
-        <w:pBdr>
-          <w:bottom w:val="single" w:sz="20" w:space="2" w:color="0E7690"/>
-        </w:pBdr>
+        <w:spacing w:after="200"/>
       </w:pPr>
     </w:p>
     <w:p>
       <w:pPr>
-        <w:spacing w:after="200" w:before="0"/>
+        <w:spacing w:after="200"/>
       </w:pPr>
     </w:p>
     <w:p>
       <w:pPr>
-        <w:spacing w:after="200" w:before="0"/>
+        <w:spacing w:after="200"/>
       </w:pPr>
     </w:p>
     <w:p>
       <w:pPr>
-        <w:spacing w:after="200" w:before="0"/>
+        <w:spacing w:after="200"/>
       </w:pPr>
     </w:p>
     <w:p>
       <w:pPr>
-        <w:spacing w:after="200" w:before="0"/>
+        <w:jc w:val="center"/>
+        <w:pBdr>
+          <w:bottom w:val="single" w:sz="6" w:space="6" w:color="CFCFCF"/>
+        </w:pBdr>
       </w:pPr>
     </w:p>
     <w:p>
       <w:pPr>
-        <w:spacing w:after="200" w:before="0"/>
-      </w:pPr>
-    </w:p>
-    <w:p>
-      <w:pPr>
-        <w:spacing w:after="80"/>
+        <w:spacing w:before="320" w:after="160"/>
         <w:jc w:val="center"/>
       </w:pPr>
       <w:r>
         <w:rPr>
-          <w:rFonts w:ascii="Calibri" w:hAnsi="Calibri"/>
           <w:b/>
-          <w:color w:val="0E7690"/>
-          <w:sz w:val="24"/>
+          <w:color w:val="111111"/>
+          <w:sz w:val="56"/>
         </w:rPr>
-        <w:t>JEDDAH YACHT CLUB &amp; MARINA  (JYC)</w:t>
+        <w:t>TECHNICAL SUBMITTAL</w:t>
       </w:r>
     </w:p>
     <w:p>
       <w:pPr>
-        <w:spacing w:after="480"/>
+        <w:spacing w:after="80"/>
         <w:jc w:val="center"/>
       </w:pPr>
       <w:r>
         <w:rPr>
-          <w:rFonts w:ascii="Calibri" w:hAnsi="Calibri"/>
-          <w:color w:val="444A52"/>
+          <w:b/>
+          <w:color w:val="26B8EF"/>
           <w:sz w:val="26"/>
         </w:rPr>
         <w:t>Marina Infrastructure Maintenance and Rehabilitation Works</w:t>
@@ -141,60 +60,24 @@
     </w:p>
     <w:p>
       <w:pPr>
-        <w:spacing w:after="120"/>
+        <w:spacing w:after="280"/>
         <w:jc w:val="center"/>
       </w:pPr>
       <w:r>
         <w:rPr>
-          <w:rFonts w:ascii="Calibri" w:hAnsi="Calibri"/>
-          <w:b/>
-          <w:color w:val="0B1F3A"/>
-          <w:sz w:val="68"/>
+          <w:color w:val="3A3A3A"/>
+          <w:sz w:val="23"/>
         </w:rPr>
-        <w:t>TECHNICAL SUBMITTAL</w:t>
+        <w:t>Jeddah Yacht Club &amp; Marina (JYC)</w:t>
       </w:r>
     </w:p>
     <w:p>
       <w:pPr>
+        <w:spacing w:after="400"/>
         <w:jc w:val="center"/>
-      </w:pPr>
-      <w:r>
-        <w:rPr>
-          <w:i/>
-          <w:color w:val="7A8694"/>
-          <w:sz w:val="21"/>
-        </w:rPr>
-        <w:t>Inspection · Repair · Refurbishment · Replacement · Protective Maintenance</w:t>
-      </w:r>
-    </w:p>
-    <w:p>
-      <w:pPr>
-        <w:spacing w:after="200" w:before="0"/>
-      </w:pPr>
-    </w:p>
-    <w:p>
-      <w:pPr>
-        <w:spacing w:after="200" w:before="0"/>
-      </w:pPr>
-    </w:p>
-    <w:p>
-      <w:pPr>
-        <w:spacing w:after="200" w:before="0"/>
-      </w:pPr>
-    </w:p>
-    <w:p>
-      <w:pPr>
-        <w:spacing w:after="200" w:before="0"/>
-      </w:pPr>
-    </w:p>
-    <w:p>
-      <w:pPr>
-        <w:spacing w:after="200" w:before="0"/>
-      </w:pPr>
-    </w:p>
-    <w:p>
-      <w:pPr>
-        <w:spacing w:after="200" w:before="0"/>
+        <w:pBdr>
+          <w:bottom w:val="single" w:sz="14" w:space="6" w:color="26B8EF"/>
+        </w:pBdr>
       </w:pPr>
     </w:p>
     <w:tbl>
@@ -203,28 +86,28 @@
         <w:jc w:val="center"/>
         <w:tblLook w:firstColumn="1" w:firstRow="1" w:lastColumn="0" w:lastRow="0" w:noHBand="0" w:noVBand="1" w:val="04A0"/>
         <w:tblBorders>
-          <w:top w:val="single" w:sz="6" w:space="0" w:color="C9D6E2"/>
-          <w:left w:val="single" w:sz="6" w:space="0" w:color="C9D6E2"/>
-          <w:bottom w:val="single" w:sz="6" w:space="0" w:color="C9D6E2"/>
-          <w:right w:val="single" w:sz="6" w:space="0" w:color="C9D6E2"/>
-          <w:insideH w:val="single" w:sz="6" w:space="0" w:color="C9D6E2"/>
-          <w:insideV w:val="single" w:sz="6" w:space="0" w:color="C9D6E2"/>
+          <w:top w:val="single" w:sz="6" w:space="0" w:color="CFCFCF"/>
+          <w:left w:val="single" w:sz="6" w:space="0" w:color="CFCFCF"/>
+          <w:bottom w:val="single" w:sz="6" w:space="0" w:color="CFCFCF"/>
+          <w:right w:val="single" w:sz="6" w:space="0" w:color="CFCFCF"/>
+          <w:insideH w:val="single" w:sz="6" w:space="0" w:color="CFCFCF"/>
+          <w:insideV w:val="single" w:sz="6" w:space="0" w:color="CFCFCF"/>
         </w:tblBorders>
       </w:tblPr>
       <w:tblGrid>
-        <w:gridCol w:w="4873"/>
-        <w:gridCol w:w="4873"/>
+        <w:gridCol w:w="4986"/>
+        <w:gridCol w:w="4986"/>
       </w:tblGrid>
       <w:tr>
         <w:tc>
           <w:tcPr>
-            <w:tcW w:type="dxa" w:w="2268"/>
-            <w:shd w:val="clear" w:color="auto" w:fill="0B1F3A"/>
+            <w:tcW w:type="dxa" w:w="2835"/>
+            <w:shd w:val="clear" w:color="auto" w:fill="111111"/>
             <w:tcMar>
-              <w:top w:w="60" w:type="dxa"/>
-              <w:bottom w:w="60" w:type="dxa"/>
-              <w:start w:w="110" w:type="dxa"/>
-              <w:end w:w="110" w:type="dxa"/>
+              <w:top w:w="70" w:type="dxa"/>
+              <w:bottom w:w="70" w:type="dxa"/>
+              <w:start w:w="120" w:type="dxa"/>
+              <w:end w:w="120" w:type="dxa"/>
             </w:tcMar>
             <w:vAlign w:val="center"/>
           </w:tcPr>
@@ -246,12 +129,12 @@
         </w:tc>
         <w:tc>
           <w:tcPr>
-            <w:tcW w:type="dxa" w:w="6520"/>
+            <w:tcW w:type="dxa" w:w="6803"/>
             <w:tcMar>
-              <w:top w:w="60" w:type="dxa"/>
-              <w:bottom w:w="60" w:type="dxa"/>
-              <w:start w:w="110" w:type="dxa"/>
-              <w:end w:w="110" w:type="dxa"/>
+              <w:top w:w="70" w:type="dxa"/>
+              <w:bottom w:w="70" w:type="dxa"/>
+              <w:start w:w="120" w:type="dxa"/>
+              <w:end w:w="120" w:type="dxa"/>
             </w:tcMar>
             <w:vAlign w:val="center"/>
           </w:tcPr>
@@ -264,10 +147,10 @@
               <w:rPr>
                 <w:rFonts w:ascii="Calibri" w:hAnsi="Calibri"/>
                 <w:b w:val="0"/>
-                <w:color w:val="444A52"/>
+                <w:color w:val="1F1F1F"/>
                 <w:sz w:val="19"/>
               </w:rPr>
-              <w:t>Marina Infrastructure Maintenance &amp; Rehabilitation Works</w:t>
+              <w:t>Jeddah Yacht Club &amp; Marina (JYC)</w:t>
             </w:r>
           </w:p>
         </w:tc>
@@ -275,13 +158,13 @@
       <w:tr>
         <w:tc>
           <w:tcPr>
-            <w:tcW w:type="dxa" w:w="2268"/>
-            <w:shd w:val="clear" w:color="auto" w:fill="0B1F3A"/>
+            <w:tcW w:type="dxa" w:w="2835"/>
+            <w:shd w:val="clear" w:color="auto" w:fill="111111"/>
             <w:tcMar>
-              <w:top w:w="60" w:type="dxa"/>
-              <w:bottom w:w="60" w:type="dxa"/>
-              <w:start w:w="110" w:type="dxa"/>
-              <w:end w:w="110" w:type="dxa"/>
+              <w:top w:w="70" w:type="dxa"/>
+              <w:bottom w:w="70" w:type="dxa"/>
+              <w:start w:w="120" w:type="dxa"/>
+              <w:end w:w="120" w:type="dxa"/>
             </w:tcMar>
             <w:vAlign w:val="center"/>
           </w:tcPr>
@@ -297,20 +180,20 @@
                 <w:color w:val="FFFFFF"/>
                 <w:sz w:val="19"/>
               </w:rPr>
-              <w:t>Client</w:t>
+              <w:t>Client / Consultant</w:t>
             </w:r>
           </w:p>
         </w:tc>
         <w:tc>
           <w:tcPr>
-            <w:tcW w:type="dxa" w:w="6520"/>
+            <w:tcW w:type="dxa" w:w="6803"/>
             <w:tcMar>
-              <w:top w:w="60" w:type="dxa"/>
-              <w:bottom w:w="60" w:type="dxa"/>
-              <w:start w:w="110" w:type="dxa"/>
-              <w:end w:w="110" w:type="dxa"/>
+              <w:top w:w="70" w:type="dxa"/>
+              <w:bottom w:w="70" w:type="dxa"/>
+              <w:start w:w="120" w:type="dxa"/>
+              <w:end w:w="120" w:type="dxa"/>
             </w:tcMar>
-            <w:shd w:val="clear" w:color="auto" w:fill="F2F6FA"/>
+            <w:shd w:val="clear" w:color="auto" w:fill="F2F2F2"/>
             <w:vAlign w:val="center"/>
           </w:tcPr>
           <w:p>
@@ -322,10 +205,10 @@
               <w:rPr>
                 <w:rFonts w:ascii="Calibri" w:hAnsi="Calibri"/>
                 <w:b w:val="0"/>
-                <w:color w:val="444A52"/>
+                <w:color w:val="1F1F1F"/>
                 <w:sz w:val="19"/>
               </w:rPr>
-              <w:t>Jeddah Yacht Club &amp; Marina (JYC) / SELA</w:t>
+              <w:t>SELA</w:t>
             </w:r>
           </w:p>
         </w:tc>
@@ -333,13 +216,13 @@
       <w:tr>
         <w:tc>
           <w:tcPr>
-            <w:tcW w:type="dxa" w:w="2268"/>
-            <w:shd w:val="clear" w:color="auto" w:fill="0B1F3A"/>
+            <w:tcW w:type="dxa" w:w="2835"/>
+            <w:shd w:val="clear" w:color="auto" w:fill="111111"/>
             <w:tcMar>
-              <w:top w:w="60" w:type="dxa"/>
-              <w:bottom w:w="60" w:type="dxa"/>
-              <w:start w:w="110" w:type="dxa"/>
-              <w:end w:w="110" w:type="dxa"/>
+              <w:top w:w="70" w:type="dxa"/>
+              <w:bottom w:w="70" w:type="dxa"/>
+              <w:start w:w="120" w:type="dxa"/>
+              <w:end w:w="120" w:type="dxa"/>
             </w:tcMar>
             <w:vAlign w:val="center"/>
           </w:tcPr>
@@ -355,18 +238,18 @@
                 <w:color w:val="FFFFFF"/>
                 <w:sz w:val="19"/>
               </w:rPr>
-              <w:t>Contractor</w:t>
+              <w:t>Document No.</w:t>
             </w:r>
           </w:p>
         </w:tc>
         <w:tc>
           <w:tcPr>
-            <w:tcW w:type="dxa" w:w="6520"/>
+            <w:tcW w:type="dxa" w:w="6803"/>
             <w:tcMar>
-              <w:top w:w="60" w:type="dxa"/>
-              <w:bottom w:w="60" w:type="dxa"/>
-              <w:start w:w="110" w:type="dxa"/>
-              <w:end w:w="110" w:type="dxa"/>
+              <w:top w:w="70" w:type="dxa"/>
+              <w:bottom w:w="70" w:type="dxa"/>
+              <w:start w:w="120" w:type="dxa"/>
+              <w:end w:w="120" w:type="dxa"/>
             </w:tcMar>
             <w:vAlign w:val="center"/>
           </w:tcPr>
@@ -379,10 +262,10 @@
               <w:rPr>
                 <w:rFonts w:ascii="Calibri" w:hAnsi="Calibri"/>
                 <w:b w:val="0"/>
-                <w:color w:val="444A52"/>
+                <w:color w:val="1F1F1F"/>
                 <w:sz w:val="19"/>
               </w:rPr>
-              <w:t>Skylance</w:t>
+              <w:t>TS-SL-260629</w:t>
             </w:r>
           </w:p>
         </w:tc>
@@ -390,13 +273,13 @@
       <w:tr>
         <w:tc>
           <w:tcPr>
-            <w:tcW w:type="dxa" w:w="2268"/>
-            <w:shd w:val="clear" w:color="auto" w:fill="0B1F3A"/>
+            <w:tcW w:type="dxa" w:w="2835"/>
+            <w:shd w:val="clear" w:color="auto" w:fill="111111"/>
             <w:tcMar>
-              <w:top w:w="60" w:type="dxa"/>
-              <w:bottom w:w="60" w:type="dxa"/>
-              <w:start w:w="110" w:type="dxa"/>
-              <w:end w:w="110" w:type="dxa"/>
+              <w:top w:w="70" w:type="dxa"/>
+              <w:bottom w:w="70" w:type="dxa"/>
+              <w:start w:w="120" w:type="dxa"/>
+              <w:end w:w="120" w:type="dxa"/>
             </w:tcMar>
             <w:vAlign w:val="center"/>
           </w:tcPr>
@@ -412,20 +295,20 @@
                 <w:color w:val="FFFFFF"/>
                 <w:sz w:val="19"/>
               </w:rPr>
-              <w:t>Document</w:t>
+              <w:t>Revision</w:t>
             </w:r>
           </w:p>
         </w:tc>
         <w:tc>
           <w:tcPr>
-            <w:tcW w:type="dxa" w:w="6520"/>
+            <w:tcW w:type="dxa" w:w="6803"/>
             <w:tcMar>
-              <w:top w:w="60" w:type="dxa"/>
-              <w:bottom w:w="60" w:type="dxa"/>
-              <w:start w:w="110" w:type="dxa"/>
-              <w:end w:w="110" w:type="dxa"/>
+              <w:top w:w="70" w:type="dxa"/>
+              <w:bottom w:w="70" w:type="dxa"/>
+              <w:start w:w="120" w:type="dxa"/>
+              <w:end w:w="120" w:type="dxa"/>
             </w:tcMar>
-            <w:shd w:val="clear" w:color="auto" w:fill="F2F6FA"/>
+            <w:shd w:val="clear" w:color="auto" w:fill="F2F2F2"/>
             <w:vAlign w:val="center"/>
           </w:tcPr>
           <w:p>
@@ -437,10 +320,10 @@
               <w:rPr>
                 <w:rFonts w:ascii="Calibri" w:hAnsi="Calibri"/>
                 <w:b w:val="0"/>
-                <w:color w:val="444A52"/>
+                <w:color w:val="1F1F1F"/>
                 <w:sz w:val="19"/>
               </w:rPr>
-              <w:t>Technical Submittal</w:t>
+              <w:t>Rev A – For Design Review</w:t>
             </w:r>
           </w:p>
         </w:tc>
@@ -448,13 +331,13 @@
       <w:tr>
         <w:tc>
           <w:tcPr>
-            <w:tcW w:type="dxa" w:w="2268"/>
-            <w:shd w:val="clear" w:color="auto" w:fill="0B1F3A"/>
+            <w:tcW w:type="dxa" w:w="2835"/>
+            <w:shd w:val="clear" w:color="auto" w:fill="111111"/>
             <w:tcMar>
-              <w:top w:w="60" w:type="dxa"/>
-              <w:bottom w:w="60" w:type="dxa"/>
-              <w:start w:w="110" w:type="dxa"/>
-              <w:end w:w="110" w:type="dxa"/>
+              <w:top w:w="70" w:type="dxa"/>
+              <w:bottom w:w="70" w:type="dxa"/>
+              <w:start w:w="120" w:type="dxa"/>
+              <w:end w:w="120" w:type="dxa"/>
             </w:tcMar>
             <w:vAlign w:val="center"/>
           </w:tcPr>
@@ -470,18 +353,18 @@
                 <w:color w:val="FFFFFF"/>
                 <w:sz w:val="19"/>
               </w:rPr>
-              <w:t>Document Ref.</w:t>
+              <w:t>Prepared By</w:t>
             </w:r>
           </w:p>
         </w:tc>
         <w:tc>
           <w:tcPr>
-            <w:tcW w:type="dxa" w:w="6520"/>
+            <w:tcW w:type="dxa" w:w="6803"/>
             <w:tcMar>
-              <w:top w:w="60" w:type="dxa"/>
-              <w:bottom w:w="60" w:type="dxa"/>
-              <w:start w:w="110" w:type="dxa"/>
-              <w:end w:w="110" w:type="dxa"/>
+              <w:top w:w="70" w:type="dxa"/>
+              <w:bottom w:w="70" w:type="dxa"/>
+              <w:start w:w="120" w:type="dxa"/>
+              <w:end w:w="120" w:type="dxa"/>
             </w:tcMar>
             <w:vAlign w:val="center"/>
           </w:tcPr>
@@ -494,10 +377,10 @@
               <w:rPr>
                 <w:rFonts w:ascii="Calibri" w:hAnsi="Calibri"/>
                 <w:b w:val="0"/>
-                <w:color w:val="444A52"/>
+                <w:color w:val="1F1F1F"/>
                 <w:sz w:val="19"/>
               </w:rPr>
-              <w:t>SKL-JYC-TS-001  ·  Rev. 0</w:t>
+              <w:t>SKYLANCE TECHNICAL SERVICES</w:t>
             </w:r>
           </w:p>
         </w:tc>
@@ -505,13 +388,13 @@
       <w:tr>
         <w:tc>
           <w:tcPr>
-            <w:tcW w:type="dxa" w:w="2268"/>
-            <w:shd w:val="clear" w:color="auto" w:fill="0B1F3A"/>
+            <w:tcW w:type="dxa" w:w="2835"/>
+            <w:shd w:val="clear" w:color="auto" w:fill="111111"/>
             <w:tcMar>
-              <w:top w:w="60" w:type="dxa"/>
-              <w:bottom w:w="60" w:type="dxa"/>
-              <w:start w:w="110" w:type="dxa"/>
-              <w:end w:w="110" w:type="dxa"/>
+              <w:top w:w="70" w:type="dxa"/>
+              <w:bottom w:w="70" w:type="dxa"/>
+              <w:start w:w="120" w:type="dxa"/>
+              <w:end w:w="120" w:type="dxa"/>
             </w:tcMar>
             <w:vAlign w:val="center"/>
           </w:tcPr>
@@ -533,14 +416,14 @@
         </w:tc>
         <w:tc>
           <w:tcPr>
-            <w:tcW w:type="dxa" w:w="6520"/>
+            <w:tcW w:type="dxa" w:w="6803"/>
             <w:tcMar>
-              <w:top w:w="60" w:type="dxa"/>
-              <w:bottom w:w="60" w:type="dxa"/>
-              <w:start w:w="110" w:type="dxa"/>
-              <w:end w:w="110" w:type="dxa"/>
+              <w:top w:w="70" w:type="dxa"/>
+              <w:bottom w:w="70" w:type="dxa"/>
+              <w:start w:w="120" w:type="dxa"/>
+              <w:end w:w="120" w:type="dxa"/>
             </w:tcMar>
-            <w:shd w:val="clear" w:color="auto" w:fill="F2F6FA"/>
+            <w:shd w:val="clear" w:color="auto" w:fill="F2F2F2"/>
             <w:vAlign w:val="center"/>
           </w:tcPr>
           <w:p>
@@ -552,10 +435,67 @@
               <w:rPr>
                 <w:rFonts w:ascii="Calibri" w:hAnsi="Calibri"/>
                 <w:b w:val="0"/>
-                <w:color w:val="444A52"/>
+                <w:color w:val="1F1F1F"/>
                 <w:sz w:val="19"/>
               </w:rPr>
-              <w:t>June 2026</w:t>
+              <w:t>29 Jun 2026</w:t>
+            </w:r>
+          </w:p>
+        </w:tc>
+      </w:tr>
+      <w:tr>
+        <w:tc>
+          <w:tcPr>
+            <w:tcW w:type="dxa" w:w="2835"/>
+            <w:shd w:val="clear" w:color="auto" w:fill="111111"/>
+            <w:tcMar>
+              <w:top w:w="70" w:type="dxa"/>
+              <w:bottom w:w="70" w:type="dxa"/>
+              <w:start w:w="120" w:type="dxa"/>
+              <w:end w:w="120" w:type="dxa"/>
+            </w:tcMar>
+            <w:vAlign w:val="center"/>
+          </w:tcPr>
+          <w:p>
+            <w:pPr>
+              <w:spacing w:after="40" w:before="40"/>
+              <w:jc w:val="left"/>
+            </w:pPr>
+            <w:r>
+              <w:rPr>
+                <w:rFonts w:ascii="Calibri" w:hAnsi="Calibri"/>
+                <w:b/>
+                <w:color w:val="FFFFFF"/>
+                <w:sz w:val="19"/>
+              </w:rPr>
+              <w:t>Classification</w:t>
+            </w:r>
+          </w:p>
+        </w:tc>
+        <w:tc>
+          <w:tcPr>
+            <w:tcW w:type="dxa" w:w="6803"/>
+            <w:tcMar>
+              <w:top w:w="70" w:type="dxa"/>
+              <w:bottom w:w="70" w:type="dxa"/>
+              <w:start w:w="120" w:type="dxa"/>
+              <w:end w:w="120" w:type="dxa"/>
+            </w:tcMar>
+            <w:vAlign w:val="center"/>
+          </w:tcPr>
+          <w:p>
+            <w:pPr>
+              <w:spacing w:after="40" w:before="40"/>
+              <w:jc w:val="left"/>
+            </w:pPr>
+            <w:r>
+              <w:rPr>
+                <w:rFonts w:ascii="Calibri" w:hAnsi="Calibri"/>
+                <w:b w:val="0"/>
+                <w:color w:val="1F1F1F"/>
+                <w:sz w:val="19"/>
+              </w:rPr>
+              <w:t>Technical Submittal – For Review &amp; Approval</w:t>
             </w:r>
           </w:p>
         </w:tc>
@@ -563,91 +503,182 @@
     </w:tbl>
     <w:p>
       <w:pPr>
-        <w:sectPr>
-          <w:pgSz w:w="12240" w:h="15840"/>
-          <w:pgMar w:top="1247" w:right="1247" w:bottom="1134" w:left="1247" w:header="624" w:footer="624" w:gutter="0"/>
-          <w:cols w:space="720"/>
-          <w:titlePg/>
-          <w:docGrid w:linePitch="360"/>
-        </w:sectPr>
+        <w:spacing w:after="200"/>
       </w:pPr>
     </w:p>
     <w:p>
       <w:pPr>
-        <w:keepNext/>
-        <w:spacing w:before="320" w:after="120"/>
-        <w:pBdr>
-          <w:bottom w:val="single" w:sz="12" w:space="4" w:color="1C4E80"/>
-        </w:pBdr>
+        <w:spacing w:after="60"/>
+        <w:jc w:val="center"/>
       </w:pPr>
       <w:r>
         <w:rPr>
-          <w:rFonts w:ascii="Calibri" w:hAnsi="Calibri"/>
-          <w:b/>
-          <w:color w:val="0E7690"/>
-          <w:sz w:val="28"/>
+          <w:i/>
+          <w:color w:val="888888"/>
+          <w:sz w:val="17"/>
         </w:rPr>
-        <w:t xml:space="preserve">1.  </w:t>
-      </w:r>
-      <w:r>
-        <w:rPr>
-          <w:rFonts w:ascii="Calibri" w:hAnsi="Calibri"/>
-          <w:b/>
-          <w:color w:val="0B1F3A"/>
-          <w:sz w:val="27"/>
-        </w:rPr>
-        <w:t>INTRODUCTION</w:t>
+        <w:t>This document is prepared by Skylance Technical Services for submission to the Client / Consultant for review and approval.</w:t>
       </w:r>
     </w:p>
     <w:p>
+      <w:pPr>
+        <w:spacing w:after="60"/>
+        <w:jc w:val="center"/>
+      </w:pPr>
       <w:r>
         <w:rPr>
-          <w:color w:val="444A52"/>
+          <w:i/>
+          <w:color w:val="888888"/>
+          <w:sz w:val="17"/>
+        </w:rPr>
+        <w:t>All specified methods and materials are subject to final approval. Actual performance may vary depending on site conditions and maintenance practices.</w:t>
+      </w:r>
+    </w:p>
+    <w:p>
+      <w:pPr>
+        <w:sectPr>
+          <w:headerReference w:type="default" r:id="rId9"/>
+          <w:footerReference w:type="default" r:id="rId10"/>
+          <w:pgSz w:w="12240" w:h="15840"/>
+          <w:pgMar w:top="1644" w:right="1134" w:bottom="1247" w:left="1134" w:header="227" w:footer="227" w:gutter="0"/>
+          <w:cols w:space="720"/>
+          <w:docGrid w:linePitch="360"/>
+        </w:sectPr>
+      </w:pPr>
+    </w:p>
+    <w:tbl>
+      <w:tblPr>
+        <w:tblW w:type="auto" w:w="0"/>
+        <w:jc w:val="center"/>
+        <w:tblLook w:firstColumn="1" w:firstRow="1" w:lastColumn="0" w:lastRow="0" w:noHBand="0" w:noVBand="1" w:val="04A0"/>
+        <w:tblBorders>
+          <w:top w:val="none"/>
+          <w:left w:val="none"/>
+          <w:bottom w:val="none"/>
+          <w:right w:val="none"/>
+          <w:insideH w:val="none"/>
+          <w:insideV w:val="none"/>
+        </w:tblBorders>
+      </w:tblPr>
+      <w:tblGrid>
+        <w:gridCol w:w="9972"/>
+      </w:tblGrid>
+      <w:tr>
+        <w:tc>
+          <w:tcPr>
+            <w:tcW w:type="dxa" w:w="9972"/>
+            <w:shd w:val="clear" w:color="auto" w:fill="111111"/>
+            <w:tcMar>
+              <w:top w:w="90" w:type="dxa"/>
+              <w:bottom w:w="90" w:type="dxa"/>
+              <w:start w:w="140" w:type="dxa"/>
+              <w:end w:w="120" w:type="dxa"/>
+            </w:tcMar>
+            <w:tcBorders>
+              <w:start w:val="single" w:sz="22" w:space="0" w:color="26B8EF"/>
+            </w:tcBorders>
+          </w:tcPr>
+          <w:p>
+            <w:r>
+              <w:rPr>
+                <w:rFonts w:ascii="Calibri" w:hAnsi="Calibri"/>
+                <w:b/>
+                <w:color w:val="FFFFFF"/>
+                <w:sz w:val="23"/>
+              </w:rPr>
+              <w:t>1.  INTRODUCTION</w:t>
+            </w:r>
+          </w:p>
+        </w:tc>
+      </w:tr>
+    </w:tbl>
+    <w:p>
+      <w:pPr>
+        <w:spacing w:after="40"/>
+      </w:pPr>
+    </w:p>
+    <w:p>
+      <w:pPr>
+        <w:jc w:val="both"/>
+      </w:pPr>
+      <w:r>
+        <w:rPr>
+          <w:color w:val="1F1F1F"/>
           <w:sz w:val="21"/>
         </w:rPr>
         <w:t>This document has been developed to describe the technical details of the Jeddah Yacht Club &amp; Marina (JYC) Marina Infrastructure Maintenance and Rehabilitation Works, covering the inspection, repair, refurbishment, replacement and protective maintenance of marina floating assets, gangways, wave breaker structures, quay wall surfaces, navigation poles and associated marine assets.</w:t>
       </w:r>
     </w:p>
     <w:p>
+      <w:pPr>
+        <w:jc w:val="both"/>
+      </w:pPr>
       <w:r>
         <w:rPr>
-          <w:color w:val="444A52"/>
+          <w:color w:val="1F1F1F"/>
           <w:sz w:val="21"/>
         </w:rPr>
-        <w:t>Jeddah Yacht Club &amp; Marina (JYC) has invited qualified marine infrastructure contractors to undertake these works. Skylance presents this Technical Submittal in response, setting out the structure-wise scope of work, methods and material standards to be applied across the marina in accordance with applicable Saudi Arabian regulations and recognised marine industry standards.</w:t>
+        <w:t>Jeddah Yacht Club &amp; Marina (JYC) has invited qualified marine infrastructure contractors to undertake these works. Skylance Technical Services presents this Technical Submittal in response, setting out the structure-wise scope of work, methods and material standards to be applied across the marina in accordance with applicable Saudi Arabian regulations and recognised marine industry standards.</w:t>
       </w:r>
     </w:p>
+    <w:tbl>
+      <w:tblPr>
+        <w:tblW w:type="auto" w:w="0"/>
+        <w:jc w:val="center"/>
+        <w:tblLook w:firstColumn="1" w:firstRow="1" w:lastColumn="0" w:lastRow="0" w:noHBand="0" w:noVBand="1" w:val="04A0"/>
+        <w:tblBorders>
+          <w:top w:val="none"/>
+          <w:left w:val="none"/>
+          <w:bottom w:val="none"/>
+          <w:right w:val="none"/>
+          <w:insideH w:val="none"/>
+          <w:insideV w:val="none"/>
+        </w:tblBorders>
+      </w:tblPr>
+      <w:tblGrid>
+        <w:gridCol w:w="9972"/>
+      </w:tblGrid>
+      <w:tr>
+        <w:tc>
+          <w:tcPr>
+            <w:tcW w:type="dxa" w:w="9972"/>
+            <w:shd w:val="clear" w:color="auto" w:fill="111111"/>
+            <w:tcMar>
+              <w:top w:w="90" w:type="dxa"/>
+              <w:bottom w:w="90" w:type="dxa"/>
+              <w:start w:w="140" w:type="dxa"/>
+              <w:end w:w="120" w:type="dxa"/>
+            </w:tcMar>
+            <w:tcBorders>
+              <w:start w:val="single" w:sz="22" w:space="0" w:color="26B8EF"/>
+            </w:tcBorders>
+          </w:tcPr>
+          <w:p>
+            <w:r>
+              <w:rPr>
+                <w:rFonts w:ascii="Calibri" w:hAnsi="Calibri"/>
+                <w:b/>
+                <w:color w:val="FFFFFF"/>
+                <w:sz w:val="23"/>
+              </w:rPr>
+              <w:t>2.  OBJECTIVE</w:t>
+            </w:r>
+          </w:p>
+        </w:tc>
+      </w:tr>
+    </w:tbl>
     <w:p>
       <w:pPr>
-        <w:keepNext/>
-        <w:spacing w:before="320" w:after="120"/>
-        <w:pBdr>
-          <w:bottom w:val="single" w:sz="12" w:space="4" w:color="1C4E80"/>
-        </w:pBdr>
+        <w:spacing w:after="40"/>
+      </w:pPr>
+    </w:p>
+    <w:p>
+      <w:pPr>
+        <w:jc w:val="both"/>
       </w:pPr>
       <w:r>
         <w:rPr>
-          <w:rFonts w:ascii="Calibri" w:hAnsi="Calibri"/>
-          <w:b/>
-          <w:color w:val="0E7690"/>
-          <w:sz w:val="28"/>
-        </w:rPr>
-        <w:t xml:space="preserve">2.  </w:t>
-      </w:r>
-      <w:r>
-        <w:rPr>
-          <w:rFonts w:ascii="Calibri" w:hAnsi="Calibri"/>
-          <w:b/>
-          <w:color w:val="0B1F3A"/>
-          <w:sz w:val="27"/>
-        </w:rPr>
-        <w:t>OBJECTIVE</w:t>
-      </w:r>
-    </w:p>
-    <w:p>
-      <w:r>
-        <w:rPr>
-          <w:color w:val="444A52"/>
+          <w:color w:val="1F1F1F"/>
           <w:sz w:val="21"/>
         </w:rPr>
         <w:t>The objective of this scope of work is to restore structural integrity, improve operational safety, prevent further corrosion and extend the service life of marina assets through comprehensive maintenance works.</w:t>
@@ -655,13 +686,14 @@
     </w:p>
     <w:p>
       <w:pPr>
-        <w:spacing w:before="80" w:after="40"/>
+        <w:keepNext/>
+        <w:spacing w:before="200" w:after="60"/>
       </w:pPr>
       <w:r>
         <w:rPr>
           <w:b/>
-          <w:color w:val="0B1F3A"/>
-          <w:sz w:val="20"/>
+          <w:color w:val="26B8EF"/>
+          <w:sz w:val="22"/>
         </w:rPr>
         <w:t>In delivering the works, the Contractor shall:</w:t>
       </w:r>
@@ -674,7 +706,7 @@
       </w:pPr>
       <w:r>
         <w:rPr>
-          <w:color w:val="444A52"/>
+          <w:color w:val="1F1F1F"/>
           <w:sz w:val="21"/>
         </w:rPr>
         <w:t>Conduct a detailed site survey and verification of quantities prior to commencement.</w:t>
@@ -688,7 +720,7 @@
       </w:pPr>
       <w:r>
         <w:rPr>
-          <w:color w:val="444A52"/>
+          <w:color w:val="1F1F1F"/>
           <w:sz w:val="21"/>
         </w:rPr>
         <w:t>Supply all labour, supervision, tools, equipment, materials, consumables and marine access equipment required.</w:t>
@@ -702,7 +734,7 @@
       </w:pPr>
       <w:r>
         <w:rPr>
-          <w:color w:val="444A52"/>
+          <w:color w:val="1F1F1F"/>
           <w:sz w:val="21"/>
         </w:rPr>
         <w:t>Dispose of waste materials in accordance with local environmental regulations.</w:t>
@@ -716,7 +748,7 @@
       </w:pPr>
       <w:r>
         <w:rPr>
-          <w:color w:val="444A52"/>
+          <w:color w:val="1F1F1F"/>
           <w:sz w:val="21"/>
         </w:rPr>
         <w:t>Maintain uninterrupted marina operations where reasonably practicable.</w:t>
@@ -730,7 +762,7 @@
       </w:pPr>
       <w:r>
         <w:rPr>
-          <w:color w:val="444A52"/>
+          <w:color w:val="1F1F1F"/>
           <w:sz w:val="21"/>
         </w:rPr>
         <w:t>Comply with all applicable Saudi Arabian safety regulations and marine industry standards.</w:t>
@@ -744,7 +776,7 @@
       </w:pPr>
       <w:r>
         <w:rPr>
-          <w:color w:val="444A52"/>
+          <w:color w:val="1F1F1F"/>
           <w:sz w:val="21"/>
         </w:rPr>
         <w:t>Submit method statements, risk assessments, work schedules and quality control procedures before mobilization.</w:t>
@@ -758,43 +790,70 @@
       </w:pPr>
       <w:r>
         <w:rPr>
-          <w:color w:val="444A52"/>
+          <w:color w:val="1F1F1F"/>
           <w:sz w:val="21"/>
         </w:rPr>
         <w:t>Offer warranty on all works completed.</w:t>
       </w:r>
     </w:p>
+    <w:tbl>
+      <w:tblPr>
+        <w:tblW w:type="auto" w:w="0"/>
+        <w:jc w:val="center"/>
+        <w:tblLook w:firstColumn="1" w:firstRow="1" w:lastColumn="0" w:lastRow="0" w:noHBand="0" w:noVBand="1" w:val="04A0"/>
+        <w:tblBorders>
+          <w:top w:val="none"/>
+          <w:left w:val="none"/>
+          <w:bottom w:val="none"/>
+          <w:right w:val="none"/>
+          <w:insideH w:val="none"/>
+          <w:insideV w:val="none"/>
+        </w:tblBorders>
+      </w:tblPr>
+      <w:tblGrid>
+        <w:gridCol w:w="9972"/>
+      </w:tblGrid>
+      <w:tr>
+        <w:tc>
+          <w:tcPr>
+            <w:tcW w:type="dxa" w:w="9972"/>
+            <w:shd w:val="clear" w:color="auto" w:fill="111111"/>
+            <w:tcMar>
+              <w:top w:w="90" w:type="dxa"/>
+              <w:bottom w:w="90" w:type="dxa"/>
+              <w:start w:w="140" w:type="dxa"/>
+              <w:end w:w="120" w:type="dxa"/>
+            </w:tcMar>
+            <w:tcBorders>
+              <w:start w:val="single" w:sz="22" w:space="0" w:color="26B8EF"/>
+            </w:tcBorders>
+          </w:tcPr>
+          <w:p>
+            <w:r>
+              <w:rPr>
+                <w:rFonts w:ascii="Calibri" w:hAnsi="Calibri"/>
+                <w:b/>
+                <w:color w:val="FFFFFF"/>
+                <w:sz w:val="23"/>
+              </w:rPr>
+              <w:t>3.  SCOPE OF WORKS</w:t>
+            </w:r>
+          </w:p>
+        </w:tc>
+      </w:tr>
+    </w:tbl>
     <w:p>
       <w:pPr>
-        <w:keepNext/>
-        <w:spacing w:before="320" w:after="120"/>
-        <w:pBdr>
-          <w:bottom w:val="single" w:sz="12" w:space="4" w:color="1C4E80"/>
-        </w:pBdr>
+        <w:spacing w:after="40"/>
+      </w:pPr>
+    </w:p>
+    <w:p>
+      <w:pPr>
+        <w:jc w:val="both"/>
       </w:pPr>
       <w:r>
         <w:rPr>
-          <w:rFonts w:ascii="Calibri" w:hAnsi="Calibri"/>
-          <w:b/>
-          <w:color w:val="0E7690"/>
-          <w:sz w:val="28"/>
-        </w:rPr>
-        <w:t xml:space="preserve">3.  </w:t>
-      </w:r>
-      <w:r>
-        <w:rPr>
-          <w:rFonts w:ascii="Calibri" w:hAnsi="Calibri"/>
-          <w:b/>
-          <w:color w:val="0B1F3A"/>
-          <w:sz w:val="27"/>
-        </w:rPr>
-        <w:t>SCOPE OF WORKS</w:t>
-      </w:r>
-    </w:p>
-    <w:p>
-      <w:r>
-        <w:rPr>
-          <w:color w:val="444A52"/>
+          <w:color w:val="1F1F1F"/>
           <w:sz w:val="21"/>
         </w:rPr>
         <w:t>The scope of work includes the following structures and marine assets, with detailed scope prescribed structure-wise in the sections that follow:</w:t>
@@ -802,13 +861,27 @@
     </w:p>
     <w:p>
       <w:pPr>
+        <w:keepNext/>
+        <w:spacing w:before="200" w:after="60"/>
+      </w:pPr>
+      <w:r>
+        <w:rPr>
+          <w:b/>
+          <w:color w:val="26B8EF"/>
+          <w:sz w:val="22"/>
+        </w:rPr>
+        <w:t>Scope Includes</w:t>
+      </w:r>
+    </w:p>
+    <w:p>
+      <w:pPr>
         <w:pStyle w:val="ListBullet"/>
         <w:spacing w:after="60" w:line="264" w:lineRule="auto"/>
         <w:ind w:left="454"/>
       </w:pPr>
       <w:r>
         <w:rPr>
-          <w:color w:val="444A52"/>
+          <w:color w:val="1F1F1F"/>
           <w:sz w:val="21"/>
         </w:rPr>
         <w:t>Floating Docks A, B, C, D and K, and the Slipway Pontoon.</w:t>
@@ -822,7 +895,7 @@
       </w:pPr>
       <w:r>
         <w:rPr>
-          <w:color w:val="444A52"/>
+          <w:color w:val="1F1F1F"/>
           <w:sz w:val="21"/>
         </w:rPr>
         <w:t>Main Wave Breaker structure.</w:t>
@@ -836,7 +909,7 @@
       </w:pPr>
       <w:r>
         <w:rPr>
-          <w:color w:val="444A52"/>
+          <w:color w:val="1F1F1F"/>
           <w:sz w:val="21"/>
         </w:rPr>
         <w:t>Navigation Poles.</w:t>
@@ -850,7 +923,7 @@
       </w:pPr>
       <w:r>
         <w:rPr>
-          <w:color w:val="444A52"/>
+          <w:color w:val="1F1F1F"/>
           <w:sz w:val="21"/>
         </w:rPr>
         <w:t>Quay Wall infrastructure.</w:t>
@@ -864,57 +937,84 @@
       </w:pPr>
       <w:r>
         <w:rPr>
-          <w:color w:val="444A52"/>
+          <w:color w:val="1F1F1F"/>
           <w:sz w:val="21"/>
         </w:rPr>
         <w:t>Gangways serving all docks and the slipway pontoon.</w:t>
       </w:r>
     </w:p>
     <w:p>
+      <w:pPr>
+        <w:jc w:val="both"/>
+      </w:pPr>
       <w:r>
         <w:rPr>
-          <w:color w:val="444A52"/>
+          <w:color w:val="1F1F1F"/>
           <w:sz w:val="21"/>
         </w:rPr>
         <w:t>The detailed, structure-wise scope of work for each of the above assets is set out in Sections 4 through 11 of this submittal.</w:t>
       </w:r>
     </w:p>
+    <w:tbl>
+      <w:tblPr>
+        <w:tblW w:type="auto" w:w="0"/>
+        <w:jc w:val="center"/>
+        <w:tblLook w:firstColumn="1" w:firstRow="1" w:lastColumn="0" w:lastRow="0" w:noHBand="0" w:noVBand="1" w:val="04A0"/>
+        <w:tblBorders>
+          <w:top w:val="none"/>
+          <w:left w:val="none"/>
+          <w:bottom w:val="none"/>
+          <w:right w:val="none"/>
+          <w:insideH w:val="none"/>
+          <w:insideV w:val="none"/>
+        </w:tblBorders>
+      </w:tblPr>
+      <w:tblGrid>
+        <w:gridCol w:w="9972"/>
+      </w:tblGrid>
+      <w:tr>
+        <w:tc>
+          <w:tcPr>
+            <w:tcW w:type="dxa" w:w="9972"/>
+            <w:shd w:val="clear" w:color="auto" w:fill="111111"/>
+            <w:tcMar>
+              <w:top w:w="90" w:type="dxa"/>
+              <w:bottom w:w="90" w:type="dxa"/>
+              <w:start w:w="140" w:type="dxa"/>
+              <w:end w:w="120" w:type="dxa"/>
+            </w:tcMar>
+            <w:tcBorders>
+              <w:start w:val="single" w:sz="22" w:space="0" w:color="26B8EF"/>
+            </w:tcBorders>
+          </w:tcPr>
+          <w:p>
+            <w:r>
+              <w:rPr>
+                <w:rFonts w:ascii="Calibri" w:hAnsi="Calibri"/>
+                <w:b/>
+                <w:color w:val="FFFFFF"/>
+                <w:sz w:val="23"/>
+              </w:rPr>
+              <w:t>4.  GANGWAY REHABILITATION WORKS</w:t>
+            </w:r>
+          </w:p>
+        </w:tc>
+      </w:tr>
+    </w:tbl>
     <w:p>
       <w:pPr>
-        <w:keepNext/>
-        <w:spacing w:before="320" w:after="120"/>
-        <w:pBdr>
-          <w:bottom w:val="single" w:sz="12" w:space="4" w:color="1C4E80"/>
-        </w:pBdr>
-      </w:pPr>
-      <w:r>
-        <w:rPr>
-          <w:rFonts w:ascii="Calibri" w:hAnsi="Calibri"/>
-          <w:b/>
-          <w:color w:val="0E7690"/>
-          <w:sz w:val="28"/>
-        </w:rPr>
-        <w:t xml:space="preserve">4.  </w:t>
-      </w:r>
-      <w:r>
-        <w:rPr>
-          <w:rFonts w:ascii="Calibri" w:hAnsi="Calibri"/>
-          <w:b/>
-          <w:color w:val="0B1F3A"/>
-          <w:sz w:val="27"/>
-        </w:rPr>
-        <w:t>GANGWAY REHABILITATION WORKS</w:t>
-      </w:r>
+        <w:spacing w:after="40"/>
+      </w:pPr>
     </w:p>
     <w:p>
       <w:pPr>
-        <w:spacing w:before="40" w:after="120"/>
+        <w:spacing w:after="120"/>
       </w:pPr>
       <w:r>
         <w:rPr>
           <w:b/>
           <w:i/>
-          <w:color w:val="0E7690"/>
+          <w:color w:val="26B8EF"/>
           <w:sz w:val="19"/>
         </w:rPr>
         <w:t xml:space="preserve">Applicable to:  </w:t>
@@ -922,7 +1022,7 @@
       <w:r>
         <w:rPr>
           <w:i/>
-          <w:color w:val="444A52"/>
+          <w:color w:val="3A3A3A"/>
           <w:sz w:val="19"/>
         </w:rPr>
         <w:t>Dock A, B, C, D, K &amp; Slipway Pontoon</w:t>
@@ -936,19 +1036,10 @@
       <w:r>
         <w:rPr>
           <w:b/>
-          <w:color w:val="1C4E80"/>
+          <w:color w:val="26B8EF"/>
           <w:sz w:val="22"/>
         </w:rPr>
-        <w:t xml:space="preserve">4.1  </w:t>
-      </w:r>
-      <w:r>
-        <w:rPr>
-          <w:rFonts w:ascii="Calibri" w:hAnsi="Calibri"/>
-          <w:b/>
-          <w:color w:val="1C4E80"/>
-          <w:sz w:val="22"/>
-        </w:rPr>
-        <w:t>Timber Works</w:t>
+        <w:t>4.1  Timber Works</w:t>
       </w:r>
     </w:p>
     <w:p>
@@ -959,7 +1050,7 @@
       </w:pPr>
       <w:r>
         <w:rPr>
-          <w:color w:val="444A52"/>
+          <w:color w:val="1F1F1F"/>
           <w:sz w:val="21"/>
         </w:rPr>
         <w:t>Clean, prepare, sand and apply marine-grade protective coating to all gangway timber planks.</w:t>
@@ -973,7 +1064,7 @@
       </w:pPr>
       <w:r>
         <w:rPr>
-          <w:color w:val="444A52"/>
+          <w:color w:val="1F1F1F"/>
           <w:sz w:val="21"/>
         </w:rPr>
         <w:t>Replace any damaged timber sections identified during execution.</w:t>
@@ -987,19 +1078,10 @@
       <w:r>
         <w:rPr>
           <w:b/>
-          <w:color w:val="1C4E80"/>
+          <w:color w:val="26B8EF"/>
           <w:sz w:val="22"/>
         </w:rPr>
-        <w:t xml:space="preserve">4.2  </w:t>
-      </w:r>
-      <w:r>
-        <w:rPr>
-          <w:rFonts w:ascii="Calibri" w:hAnsi="Calibri"/>
-          <w:b/>
-          <w:color w:val="1C4E80"/>
-          <w:sz w:val="22"/>
-        </w:rPr>
-        <w:t>Roller System</w:t>
+        <w:t>4.2  Roller System</w:t>
       </w:r>
     </w:p>
     <w:p>
@@ -1010,7 +1092,7 @@
       </w:pPr>
       <w:r>
         <w:rPr>
-          <w:color w:val="444A52"/>
+          <w:color w:val="1F1F1F"/>
           <w:sz w:val="21"/>
         </w:rPr>
         <w:t>Remove and replace damaged gangway rollers.</w:t>
@@ -1024,7 +1106,7 @@
       </w:pPr>
       <w:r>
         <w:rPr>
-          <w:color w:val="444A52"/>
+          <w:color w:val="1F1F1F"/>
           <w:sz w:val="21"/>
         </w:rPr>
         <w:t>Supply additional PVC rollers as operational spare stock.</w:t>
@@ -1038,19 +1120,10 @@
       <w:r>
         <w:rPr>
           <w:b/>
-          <w:color w:val="1C4E80"/>
+          <w:color w:val="26B8EF"/>
           <w:sz w:val="22"/>
         </w:rPr>
-        <w:t xml:space="preserve">4.3  </w:t>
-      </w:r>
-      <w:r>
-        <w:rPr>
-          <w:rFonts w:ascii="Calibri" w:hAnsi="Calibri"/>
-          <w:b/>
-          <w:color w:val="1C4E80"/>
-          <w:sz w:val="22"/>
-        </w:rPr>
-        <w:t>Teflon Wear Protection</w:t>
+        <w:t>4.3  Teflon Wear Protection</w:t>
       </w:r>
     </w:p>
     <w:p>
@@ -1061,7 +1134,7 @@
       </w:pPr>
       <w:r>
         <w:rPr>
-          <w:color w:val="444A52"/>
+          <w:color w:val="1F1F1F"/>
           <w:sz w:val="21"/>
         </w:rPr>
         <w:t>Remove damaged gangway flip protection pads.</w:t>
@@ -1075,7 +1148,7 @@
       </w:pPr>
       <w:r>
         <w:rPr>
-          <w:color w:val="444A52"/>
+          <w:color w:val="1F1F1F"/>
           <w:sz w:val="21"/>
         </w:rPr>
         <w:t>Supply and install new marine-grade Teflon wear pads.</w:t>
@@ -1089,25 +1162,19 @@
       <w:r>
         <w:rPr>
           <w:b/>
-          <w:color w:val="1C4E80"/>
+          <w:color w:val="26B8EF"/>
           <w:sz w:val="22"/>
         </w:rPr>
-        <w:t xml:space="preserve">4.4  </w:t>
-      </w:r>
-      <w:r>
-        <w:rPr>
-          <w:rFonts w:ascii="Calibri" w:hAnsi="Calibri"/>
-          <w:b/>
-          <w:color w:val="1C4E80"/>
-          <w:sz w:val="22"/>
-        </w:rPr>
-        <w:t>Structural Steel Rehabilitation</w:t>
+        <w:t>4.4  Structural Steel Rehabilitation</w:t>
       </w:r>
     </w:p>
     <w:p>
+      <w:pPr>
+        <w:jc w:val="both"/>
+      </w:pPr>
       <w:r>
         <w:rPr>
-          <w:color w:val="444A52"/>
+          <w:color w:val="1F1F1F"/>
           <w:sz w:val="21"/>
         </w:rPr>
         <w:t>Where applicable, the Contractor shall:</w:t>
@@ -1121,7 +1188,7 @@
       </w:pPr>
       <w:r>
         <w:rPr>
-          <w:color w:val="444A52"/>
+          <w:color w:val="1F1F1F"/>
           <w:sz w:val="21"/>
         </w:rPr>
         <w:t>Clean steel surfaces by mechanical preparation or approved blasting method.</w:t>
@@ -1135,7 +1202,7 @@
       </w:pPr>
       <w:r>
         <w:rPr>
-          <w:color w:val="444A52"/>
+          <w:color w:val="1F1F1F"/>
           <w:sz w:val="21"/>
         </w:rPr>
         <w:t>Remove corrosion and contaminants.</w:t>
@@ -1149,7 +1216,7 @@
       </w:pPr>
       <w:r>
         <w:rPr>
-          <w:color w:val="444A52"/>
+          <w:color w:val="1F1F1F"/>
           <w:sz w:val="21"/>
         </w:rPr>
         <w:t>Apply approved marine-grade anti-corrosion coating system.</w:t>
@@ -1163,7 +1230,7 @@
       </w:pPr>
       <w:r>
         <w:rPr>
-          <w:color w:val="444A52"/>
+          <w:color w:val="1F1F1F"/>
           <w:sz w:val="21"/>
         </w:rPr>
         <w:t>Repaint gangway H-beam support structures.</w:t>
@@ -1177,25 +1244,19 @@
       <w:r>
         <w:rPr>
           <w:b/>
-          <w:color w:val="1C4E80"/>
+          <w:color w:val="26B8EF"/>
           <w:sz w:val="22"/>
         </w:rPr>
-        <w:t xml:space="preserve">4.5  </w:t>
-      </w:r>
-      <w:r>
-        <w:rPr>
-          <w:rFonts w:ascii="Calibri" w:hAnsi="Calibri"/>
-          <w:b/>
-          <w:color w:val="1C4E80"/>
-          <w:sz w:val="22"/>
-        </w:rPr>
-        <w:t>Anchor Bolt Replacement</w:t>
+        <w:t>4.5  Anchor Bolt Replacement</w:t>
       </w:r>
     </w:p>
     <w:p>
+      <w:pPr>
+        <w:jc w:val="both"/>
+      </w:pPr>
       <w:r>
         <w:rPr>
-          <w:color w:val="444A52"/>
+          <w:color w:val="1F1F1F"/>
           <w:sz w:val="21"/>
         </w:rPr>
         <w:t>Where applicable, the Contractor shall:</w:t>
@@ -1209,7 +1270,7 @@
       </w:pPr>
       <w:r>
         <w:rPr>
-          <w:color w:val="444A52"/>
+          <w:color w:val="1F1F1F"/>
           <w:sz w:val="21"/>
         </w:rPr>
         <w:t>Remove corroded foundation bolts and nuts.</w:t>
@@ -1223,7 +1284,7 @@
       </w:pPr>
       <w:r>
         <w:rPr>
-          <w:color w:val="444A52"/>
+          <w:color w:val="1F1F1F"/>
           <w:sz w:val="21"/>
         </w:rPr>
         <w:t>Supply and install new stainless steel or approved galvanized anchor bolts.</w:t>
@@ -1237,7 +1298,7 @@
       </w:pPr>
       <w:r>
         <w:rPr>
-          <w:color w:val="444A52"/>
+          <w:color w:val="1F1F1F"/>
           <w:sz w:val="21"/>
         </w:rPr>
         <w:t>Upgrade bolt sizing where specified to improve structural stability.</w:t>
@@ -1251,25 +1312,19 @@
       <w:r>
         <w:rPr>
           <w:b/>
-          <w:color w:val="1C4E80"/>
+          <w:color w:val="26B8EF"/>
           <w:sz w:val="22"/>
         </w:rPr>
-        <w:t xml:space="preserve">4.6  </w:t>
-      </w:r>
-      <w:r>
-        <w:rPr>
-          <w:rFonts w:ascii="Calibri" w:hAnsi="Calibri"/>
-          <w:b/>
-          <w:color w:val="1C4E80"/>
-          <w:sz w:val="22"/>
-        </w:rPr>
-        <w:t>Electrical Safety Improvements</w:t>
+        <w:t>4.6  Electrical Safety Improvements</w:t>
       </w:r>
     </w:p>
     <w:p>
+      <w:pPr>
+        <w:jc w:val="both"/>
+      </w:pPr>
       <w:r>
         <w:rPr>
-          <w:color w:val="444A52"/>
+          <w:color w:val="1F1F1F"/>
           <w:sz w:val="21"/>
         </w:rPr>
         <w:t>The Contractor shall:</w:t>
@@ -1283,7 +1338,7 @@
       </w:pPr>
       <w:r>
         <w:rPr>
-          <w:color w:val="444A52"/>
+          <w:color w:val="1F1F1F"/>
           <w:sz w:val="21"/>
         </w:rPr>
         <w:t>Install weatherproof protection for all exposed dock gate electrical components.</w:t>
@@ -1297,7 +1352,7 @@
       </w:pPr>
       <w:r>
         <w:rPr>
-          <w:color w:val="444A52"/>
+          <w:color w:val="1F1F1F"/>
           <w:sz w:val="21"/>
         </w:rPr>
         <w:t>Provide suitable enclosures, sealing systems, covers and fixing arrangements.</w:t>
@@ -1311,7 +1366,7 @@
       </w:pPr>
       <w:r>
         <w:rPr>
-          <w:color w:val="444A52"/>
+          <w:color w:val="1F1F1F"/>
           <w:sz w:val="21"/>
         </w:rPr>
         <w:t>Inspect and rectify electrical grounding (earthing) systems for all gangways.</w:t>
@@ -1325,7 +1380,7 @@
       </w:pPr>
       <w:r>
         <w:rPr>
-          <w:color w:val="444A52"/>
+          <w:color w:val="1F1F1F"/>
           <w:sz w:val="21"/>
         </w:rPr>
         <w:t>Test and certify grounding resistance values following completion.</w:t>
@@ -1339,25 +1394,19 @@
       <w:r>
         <w:rPr>
           <w:b/>
-          <w:color w:val="1C4E80"/>
+          <w:color w:val="26B8EF"/>
           <w:sz w:val="22"/>
         </w:rPr>
-        <w:t xml:space="preserve">4.7  </w:t>
-      </w:r>
-      <w:r>
-        <w:rPr>
-          <w:rFonts w:ascii="Calibri" w:hAnsi="Calibri"/>
-          <w:b/>
-          <w:color w:val="1C4E80"/>
-          <w:sz w:val="22"/>
-        </w:rPr>
-        <w:t>Cable Tray Works (Docks D and K)</w:t>
+        <w:t>4.7  Cable Tray Works (Docks D and K)</w:t>
       </w:r>
     </w:p>
     <w:p>
+      <w:pPr>
+        <w:jc w:val="both"/>
+      </w:pPr>
       <w:r>
         <w:rPr>
-          <w:color w:val="444A52"/>
+          <w:color w:val="1F1F1F"/>
           <w:sz w:val="21"/>
         </w:rPr>
         <w:t>The Contractor shall:</w:t>
@@ -1371,7 +1420,7 @@
       </w:pPr>
       <w:r>
         <w:rPr>
-          <w:color w:val="444A52"/>
+          <w:color w:val="1F1F1F"/>
           <w:sz w:val="21"/>
         </w:rPr>
         <w:t>Secure under-gangway cable trays using approved marine-grade support systems.</w:t>
@@ -1385,7 +1434,7 @@
       </w:pPr>
       <w:r>
         <w:rPr>
-          <w:color w:val="444A52"/>
+          <w:color w:val="1F1F1F"/>
           <w:sz w:val="21"/>
         </w:rPr>
         <w:t>Supply and install all required fixing accessories.</w:t>
@@ -1399,57 +1448,84 @@
       </w:pPr>
       <w:r>
         <w:rPr>
-          <w:color w:val="444A52"/>
+          <w:color w:val="1F1F1F"/>
           <w:sz w:val="21"/>
         </w:rPr>
         <w:t>Ensure cable tray alignment and support integrity.</w:t>
       </w:r>
     </w:p>
     <w:p>
+      <w:pPr>
+        <w:jc w:val="both"/>
+      </w:pPr>
       <w:r>
         <w:rPr>
-          <w:color w:val="444A52"/>
+          <w:color w:val="1F1F1F"/>
           <w:sz w:val="21"/>
         </w:rPr>
         <w:t>Based on requirements identified across all dock gangways.</w:t>
       </w:r>
     </w:p>
+    <w:tbl>
+      <w:tblPr>
+        <w:tblW w:type="auto" w:w="0"/>
+        <w:jc w:val="center"/>
+        <w:tblLook w:firstColumn="1" w:firstRow="1" w:lastColumn="0" w:lastRow="0" w:noHBand="0" w:noVBand="1" w:val="04A0"/>
+        <w:tblBorders>
+          <w:top w:val="none"/>
+          <w:left w:val="none"/>
+          <w:bottom w:val="none"/>
+          <w:right w:val="none"/>
+          <w:insideH w:val="none"/>
+          <w:insideV w:val="none"/>
+        </w:tblBorders>
+      </w:tblPr>
+      <w:tblGrid>
+        <w:gridCol w:w="9972"/>
+      </w:tblGrid>
+      <w:tr>
+        <w:tc>
+          <w:tcPr>
+            <w:tcW w:type="dxa" w:w="9972"/>
+            <w:shd w:val="clear" w:color="auto" w:fill="111111"/>
+            <w:tcMar>
+              <w:top w:w="90" w:type="dxa"/>
+              <w:bottom w:w="90" w:type="dxa"/>
+              <w:start w:w="140" w:type="dxa"/>
+              <w:end w:w="120" w:type="dxa"/>
+            </w:tcMar>
+            <w:tcBorders>
+              <w:start w:val="single" w:sz="22" w:space="0" w:color="26B8EF"/>
+            </w:tcBorders>
+          </w:tcPr>
+          <w:p>
+            <w:r>
+              <w:rPr>
+                <w:rFonts w:ascii="Calibri" w:hAnsi="Calibri"/>
+                <w:b/>
+                <w:color w:val="FFFFFF"/>
+                <w:sz w:val="23"/>
+              </w:rPr>
+              <w:t>5.  PONTOON JOINT PLATE REPAIRS</w:t>
+            </w:r>
+          </w:p>
+        </w:tc>
+      </w:tr>
+    </w:tbl>
     <w:p>
       <w:pPr>
-        <w:keepNext/>
-        <w:spacing w:before="320" w:after="120"/>
-        <w:pBdr>
-          <w:bottom w:val="single" w:sz="12" w:space="4" w:color="1C4E80"/>
-        </w:pBdr>
-      </w:pPr>
-      <w:r>
-        <w:rPr>
-          <w:rFonts w:ascii="Calibri" w:hAnsi="Calibri"/>
-          <w:b/>
-          <w:color w:val="0E7690"/>
-          <w:sz w:val="28"/>
-        </w:rPr>
-        <w:t xml:space="preserve">5.  </w:t>
-      </w:r>
-      <w:r>
-        <w:rPr>
-          <w:rFonts w:ascii="Calibri" w:hAnsi="Calibri"/>
-          <w:b/>
-          <w:color w:val="0B1F3A"/>
-          <w:sz w:val="27"/>
-        </w:rPr>
-        <w:t>PONTOON JOINT PLATE REPAIRS</w:t>
-      </w:r>
+        <w:spacing w:after="40"/>
+      </w:pPr>
     </w:p>
     <w:p>
       <w:pPr>
-        <w:spacing w:before="40" w:after="120"/>
+        <w:spacing w:after="120"/>
       </w:pPr>
       <w:r>
         <w:rPr>
           <w:b/>
           <w:i/>
-          <w:color w:val="0E7690"/>
+          <w:color w:val="26B8EF"/>
           <w:sz w:val="19"/>
         </w:rPr>
         <w:t xml:space="preserve">Applicable to:  </w:t>
@@ -1457,7 +1533,7 @@
       <w:r>
         <w:rPr>
           <w:i/>
-          <w:color w:val="444A52"/>
+          <w:color w:val="3A3A3A"/>
           <w:sz w:val="19"/>
         </w:rPr>
         <w:t>Dock A, B, C, D, K</w:t>
@@ -1471,19 +1547,10 @@
       <w:r>
         <w:rPr>
           <w:b/>
-          <w:color w:val="1C4E80"/>
+          <w:color w:val="26B8EF"/>
           <w:sz w:val="22"/>
         </w:rPr>
-        <w:t xml:space="preserve">5.1  </w:t>
-      </w:r>
-      <w:r>
-        <w:rPr>
-          <w:rFonts w:ascii="Calibri" w:hAnsi="Calibri"/>
-          <w:b/>
-          <w:color w:val="1C4E80"/>
-          <w:sz w:val="22"/>
-        </w:rPr>
-        <w:t>Preferred Method (Option A)</w:t>
+        <w:t>5.1  Preferred Method (Option A)</w:t>
       </w:r>
     </w:p>
     <w:p>
@@ -1494,7 +1561,7 @@
       </w:pPr>
       <w:r>
         <w:rPr>
-          <w:color w:val="444A52"/>
+          <w:color w:val="1F1F1F"/>
           <w:sz w:val="21"/>
         </w:rPr>
         <w:t>Remove damaged joint plates.</w:t>
@@ -1508,7 +1575,7 @@
       </w:pPr>
       <w:r>
         <w:rPr>
-          <w:color w:val="444A52"/>
+          <w:color w:val="1F1F1F"/>
           <w:sz w:val="21"/>
         </w:rPr>
         <w:t>Drill two additional fixing holes on site.</w:t>
@@ -1522,7 +1589,7 @@
       </w:pPr>
       <w:r>
         <w:rPr>
-          <w:color w:val="444A52"/>
+          <w:color w:val="1F1F1F"/>
           <w:sz w:val="21"/>
         </w:rPr>
         <w:t>Install new fixings into pontoon concrete structure using approved plastic grips and marine-grade bolts.</w:t>
@@ -1536,7 +1603,7 @@
       </w:pPr>
       <w:r>
         <w:rPr>
-          <w:color w:val="444A52"/>
+          <w:color w:val="1F1F1F"/>
           <w:sz w:val="21"/>
         </w:rPr>
         <w:t>Seal all abandoned holes with approved marine repair compound.</w:t>
@@ -1550,19 +1617,10 @@
       <w:r>
         <w:rPr>
           <w:b/>
-          <w:color w:val="1C4E80"/>
+          <w:color w:val="26B8EF"/>
           <w:sz w:val="22"/>
         </w:rPr>
-        <w:t xml:space="preserve">5.2  </w:t>
-      </w:r>
-      <w:r>
-        <w:rPr>
-          <w:rFonts w:ascii="Calibri" w:hAnsi="Calibri"/>
-          <w:b/>
-          <w:color w:val="1C4E80"/>
-          <w:sz w:val="22"/>
-        </w:rPr>
-        <w:t>Alternative Method (Option B)</w:t>
+        <w:t>5.2  Alternative Method (Option B)</w:t>
       </w:r>
     </w:p>
     <w:p>
@@ -1573,7 +1631,7 @@
       </w:pPr>
       <w:r>
         <w:rPr>
-          <w:color w:val="444A52"/>
+          <w:color w:val="1F1F1F"/>
           <w:sz w:val="21"/>
         </w:rPr>
         <w:t>Weld four support bolts to joint plates where approved by JYC.</w:t>
@@ -1586,7 +1644,7 @@
       <w:r>
         <w:rPr>
           <w:b/>
-          <w:color w:val="0B1F3A"/>
+          <w:color w:val="1F1F1F"/>
           <w:sz w:val="20"/>
         </w:rPr>
         <w:t>Joint Plate Quantities</w:t>
@@ -1598,28 +1656,28 @@
         <w:jc w:val="left"/>
         <w:tblLook w:firstColumn="1" w:firstRow="1" w:lastColumn="0" w:lastRow="0" w:noHBand="0" w:noVBand="1" w:val="04A0"/>
         <w:tblBorders>
-          <w:top w:val="single" w:sz="6" w:space="0" w:color="D5DEE7"/>
-          <w:left w:val="single" w:sz="6" w:space="0" w:color="D5DEE7"/>
-          <w:bottom w:val="single" w:sz="6" w:space="0" w:color="D5DEE7"/>
-          <w:right w:val="single" w:sz="6" w:space="0" w:color="D5DEE7"/>
-          <w:insideH w:val="single" w:sz="6" w:space="0" w:color="D5DEE7"/>
-          <w:insideV w:val="single" w:sz="6" w:space="0" w:color="D5DEE7"/>
+          <w:top w:val="single" w:sz="6" w:space="0" w:color="CFCFCF"/>
+          <w:left w:val="single" w:sz="6" w:space="0" w:color="CFCFCF"/>
+          <w:bottom w:val="single" w:sz="6" w:space="0" w:color="CFCFCF"/>
+          <w:right w:val="single" w:sz="6" w:space="0" w:color="CFCFCF"/>
+          <w:insideH w:val="single" w:sz="6" w:space="0" w:color="CFCFCF"/>
+          <w:insideV w:val="single" w:sz="6" w:space="0" w:color="CFCFCF"/>
         </w:tblBorders>
       </w:tblPr>
       <w:tblGrid>
-        <w:gridCol w:w="4873"/>
-        <w:gridCol w:w="4873"/>
+        <w:gridCol w:w="4986"/>
+        <w:gridCol w:w="4986"/>
       </w:tblGrid>
       <w:tr>
         <w:tc>
           <w:tcPr>
-            <w:tcW w:type="dxa" w:w="3402"/>
-            <w:shd w:val="clear" w:color="auto" w:fill="0B1F3A"/>
+            <w:tcW w:type="dxa" w:w="4819"/>
+            <w:shd w:val="clear" w:color="auto" w:fill="111111"/>
             <w:tcMar>
-              <w:top w:w="60" w:type="dxa"/>
-              <w:bottom w:w="60" w:type="dxa"/>
-              <w:start w:w="110" w:type="dxa"/>
-              <w:end w:w="110" w:type="dxa"/>
+              <w:top w:w="70" w:type="dxa"/>
+              <w:bottom w:w="70" w:type="dxa"/>
+              <w:start w:w="120" w:type="dxa"/>
+              <w:end w:w="120" w:type="dxa"/>
             </w:tcMar>
             <w:vAlign w:val="center"/>
           </w:tcPr>
@@ -1641,13 +1699,13 @@
         </w:tc>
         <w:tc>
           <w:tcPr>
-            <w:tcW w:type="dxa" w:w="3402"/>
-            <w:shd w:val="clear" w:color="auto" w:fill="0B1F3A"/>
+            <w:tcW w:type="dxa" w:w="4819"/>
+            <w:shd w:val="clear" w:color="auto" w:fill="111111"/>
             <w:tcMar>
-              <w:top w:w="60" w:type="dxa"/>
-              <w:bottom w:w="60" w:type="dxa"/>
-              <w:start w:w="110" w:type="dxa"/>
-              <w:end w:w="110" w:type="dxa"/>
+              <w:top w:w="70" w:type="dxa"/>
+              <w:bottom w:w="70" w:type="dxa"/>
+              <w:start w:w="120" w:type="dxa"/>
+              <w:end w:w="120" w:type="dxa"/>
             </w:tcMar>
             <w:vAlign w:val="center"/>
           </w:tcPr>
@@ -1671,12 +1729,12 @@
       <w:tr>
         <w:tc>
           <w:tcPr>
-            <w:tcW w:type="dxa" w:w="3402"/>
+            <w:tcW w:type="dxa" w:w="4819"/>
             <w:tcMar>
-              <w:top w:w="60" w:type="dxa"/>
-              <w:bottom w:w="60" w:type="dxa"/>
-              <w:start w:w="110" w:type="dxa"/>
-              <w:end w:w="110" w:type="dxa"/>
+              <w:top w:w="70" w:type="dxa"/>
+              <w:bottom w:w="70" w:type="dxa"/>
+              <w:start w:w="120" w:type="dxa"/>
+              <w:end w:w="120" w:type="dxa"/>
             </w:tcMar>
             <w:vAlign w:val="center"/>
           </w:tcPr>
@@ -1689,7 +1747,7 @@
               <w:rPr>
                 <w:rFonts w:ascii="Calibri" w:hAnsi="Calibri"/>
                 <w:b/>
-                <w:color w:val="444A52"/>
+                <w:color w:val="1F1F1F"/>
                 <w:sz w:val="20"/>
               </w:rPr>
               <w:t>Dock A</w:t>
@@ -1698,12 +1756,12 @@
         </w:tc>
         <w:tc>
           <w:tcPr>
-            <w:tcW w:type="dxa" w:w="3402"/>
+            <w:tcW w:type="dxa" w:w="4819"/>
             <w:tcMar>
-              <w:top w:w="60" w:type="dxa"/>
-              <w:bottom w:w="60" w:type="dxa"/>
-              <w:start w:w="110" w:type="dxa"/>
-              <w:end w:w="110" w:type="dxa"/>
+              <w:top w:w="70" w:type="dxa"/>
+              <w:bottom w:w="70" w:type="dxa"/>
+              <w:start w:w="120" w:type="dxa"/>
+              <w:end w:w="120" w:type="dxa"/>
             </w:tcMar>
             <w:vAlign w:val="center"/>
           </w:tcPr>
@@ -1716,7 +1774,7 @@
               <w:rPr>
                 <w:rFonts w:ascii="Calibri" w:hAnsi="Calibri"/>
                 <w:b w:val="0"/>
-                <w:color w:val="444A52"/>
+                <w:color w:val="1F1F1F"/>
                 <w:sz w:val="20"/>
               </w:rPr>
               <w:t>16</w:t>
@@ -1727,13 +1785,13 @@
       <w:tr>
         <w:tc>
           <w:tcPr>
-            <w:tcW w:type="dxa" w:w="3402"/>
-            <w:shd w:val="clear" w:color="auto" w:fill="EAF1F7"/>
+            <w:tcW w:type="dxa" w:w="4819"/>
+            <w:shd w:val="clear" w:color="auto" w:fill="F2F2F2"/>
             <w:tcMar>
-              <w:top w:w="60" w:type="dxa"/>
-              <w:bottom w:w="60" w:type="dxa"/>
-              <w:start w:w="110" w:type="dxa"/>
-              <w:end w:w="110" w:type="dxa"/>
+              <w:top w:w="70" w:type="dxa"/>
+              <w:bottom w:w="70" w:type="dxa"/>
+              <w:start w:w="120" w:type="dxa"/>
+              <w:end w:w="120" w:type="dxa"/>
             </w:tcMar>
             <w:vAlign w:val="center"/>
           </w:tcPr>
@@ -1746,7 +1804,7 @@
               <w:rPr>
                 <w:rFonts w:ascii="Calibri" w:hAnsi="Calibri"/>
                 <w:b/>
-                <w:color w:val="444A52"/>
+                <w:color w:val="1F1F1F"/>
                 <w:sz w:val="20"/>
               </w:rPr>
               <w:t>Dock B</w:t>
@@ -1755,13 +1813,13 @@
         </w:tc>
         <w:tc>
           <w:tcPr>
-            <w:tcW w:type="dxa" w:w="3402"/>
-            <w:shd w:val="clear" w:color="auto" w:fill="EAF1F7"/>
+            <w:tcW w:type="dxa" w:w="4819"/>
+            <w:shd w:val="clear" w:color="auto" w:fill="F2F2F2"/>
             <w:tcMar>
-              <w:top w:w="60" w:type="dxa"/>
-              <w:bottom w:w="60" w:type="dxa"/>
-              <w:start w:w="110" w:type="dxa"/>
-              <w:end w:w="110" w:type="dxa"/>
+              <w:top w:w="70" w:type="dxa"/>
+              <w:bottom w:w="70" w:type="dxa"/>
+              <w:start w:w="120" w:type="dxa"/>
+              <w:end w:w="120" w:type="dxa"/>
             </w:tcMar>
             <w:vAlign w:val="center"/>
           </w:tcPr>
@@ -1774,7 +1832,7 @@
               <w:rPr>
                 <w:rFonts w:ascii="Calibri" w:hAnsi="Calibri"/>
                 <w:b w:val="0"/>
-                <w:color w:val="444A52"/>
+                <w:color w:val="1F1F1F"/>
                 <w:sz w:val="20"/>
               </w:rPr>
               <w:t>30</w:t>
@@ -1785,12 +1843,12 @@
       <w:tr>
         <w:tc>
           <w:tcPr>
-            <w:tcW w:type="dxa" w:w="3402"/>
+            <w:tcW w:type="dxa" w:w="4819"/>
             <w:tcMar>
-              <w:top w:w="60" w:type="dxa"/>
-              <w:bottom w:w="60" w:type="dxa"/>
-              <w:start w:w="110" w:type="dxa"/>
-              <w:end w:w="110" w:type="dxa"/>
+              <w:top w:w="70" w:type="dxa"/>
+              <w:bottom w:w="70" w:type="dxa"/>
+              <w:start w:w="120" w:type="dxa"/>
+              <w:end w:w="120" w:type="dxa"/>
             </w:tcMar>
             <w:vAlign w:val="center"/>
           </w:tcPr>
@@ -1803,7 +1861,7 @@
               <w:rPr>
                 <w:rFonts w:ascii="Calibri" w:hAnsi="Calibri"/>
                 <w:b/>
-                <w:color w:val="444A52"/>
+                <w:color w:val="1F1F1F"/>
                 <w:sz w:val="20"/>
               </w:rPr>
               <w:t>Dock C</w:t>
@@ -1812,12 +1870,12 @@
         </w:tc>
         <w:tc>
           <w:tcPr>
-            <w:tcW w:type="dxa" w:w="3402"/>
+            <w:tcW w:type="dxa" w:w="4819"/>
             <w:tcMar>
-              <w:top w:w="60" w:type="dxa"/>
-              <w:bottom w:w="60" w:type="dxa"/>
-              <w:start w:w="110" w:type="dxa"/>
-              <w:end w:w="110" w:type="dxa"/>
+              <w:top w:w="70" w:type="dxa"/>
+              <w:bottom w:w="70" w:type="dxa"/>
+              <w:start w:w="120" w:type="dxa"/>
+              <w:end w:w="120" w:type="dxa"/>
             </w:tcMar>
             <w:vAlign w:val="center"/>
           </w:tcPr>
@@ -1830,7 +1888,7 @@
               <w:rPr>
                 <w:rFonts w:ascii="Calibri" w:hAnsi="Calibri"/>
                 <w:b w:val="0"/>
-                <w:color w:val="444A52"/>
+                <w:color w:val="1F1F1F"/>
                 <w:sz w:val="20"/>
               </w:rPr>
               <w:t>18</w:t>
@@ -1841,13 +1899,13 @@
       <w:tr>
         <w:tc>
           <w:tcPr>
-            <w:tcW w:type="dxa" w:w="3402"/>
-            <w:shd w:val="clear" w:color="auto" w:fill="EAF1F7"/>
+            <w:tcW w:type="dxa" w:w="4819"/>
+            <w:shd w:val="clear" w:color="auto" w:fill="F2F2F2"/>
             <w:tcMar>
-              <w:top w:w="60" w:type="dxa"/>
-              <w:bottom w:w="60" w:type="dxa"/>
-              <w:start w:w="110" w:type="dxa"/>
-              <w:end w:w="110" w:type="dxa"/>
+              <w:top w:w="70" w:type="dxa"/>
+              <w:bottom w:w="70" w:type="dxa"/>
+              <w:start w:w="120" w:type="dxa"/>
+              <w:end w:w="120" w:type="dxa"/>
             </w:tcMar>
             <w:vAlign w:val="center"/>
           </w:tcPr>
@@ -1860,7 +1918,7 @@
               <w:rPr>
                 <w:rFonts w:ascii="Calibri" w:hAnsi="Calibri"/>
                 <w:b/>
-                <w:color w:val="444A52"/>
+                <w:color w:val="1F1F1F"/>
                 <w:sz w:val="20"/>
               </w:rPr>
               <w:t>Dock D</w:t>
@@ -1869,13 +1927,13 @@
         </w:tc>
         <w:tc>
           <w:tcPr>
-            <w:tcW w:type="dxa" w:w="3402"/>
-            <w:shd w:val="clear" w:color="auto" w:fill="EAF1F7"/>
+            <w:tcW w:type="dxa" w:w="4819"/>
+            <w:shd w:val="clear" w:color="auto" w:fill="F2F2F2"/>
             <w:tcMar>
-              <w:top w:w="60" w:type="dxa"/>
-              <w:bottom w:w="60" w:type="dxa"/>
-              <w:start w:w="110" w:type="dxa"/>
-              <w:end w:w="110" w:type="dxa"/>
+              <w:top w:w="70" w:type="dxa"/>
+              <w:bottom w:w="70" w:type="dxa"/>
+              <w:start w:w="120" w:type="dxa"/>
+              <w:end w:w="120" w:type="dxa"/>
             </w:tcMar>
             <w:vAlign w:val="center"/>
           </w:tcPr>
@@ -1888,7 +1946,7 @@
               <w:rPr>
                 <w:rFonts w:ascii="Calibri" w:hAnsi="Calibri"/>
                 <w:b w:val="0"/>
-                <w:color w:val="444A52"/>
+                <w:color w:val="1F1F1F"/>
                 <w:sz w:val="20"/>
               </w:rPr>
               <w:t>24</w:t>
@@ -1899,12 +1957,12 @@
       <w:tr>
         <w:tc>
           <w:tcPr>
-            <w:tcW w:type="dxa" w:w="3402"/>
+            <w:tcW w:type="dxa" w:w="4819"/>
             <w:tcMar>
-              <w:top w:w="60" w:type="dxa"/>
-              <w:bottom w:w="60" w:type="dxa"/>
-              <w:start w:w="110" w:type="dxa"/>
-              <w:end w:w="110" w:type="dxa"/>
+              <w:top w:w="70" w:type="dxa"/>
+              <w:bottom w:w="70" w:type="dxa"/>
+              <w:start w:w="120" w:type="dxa"/>
+              <w:end w:w="120" w:type="dxa"/>
             </w:tcMar>
             <w:vAlign w:val="center"/>
           </w:tcPr>
@@ -1917,7 +1975,7 @@
               <w:rPr>
                 <w:rFonts w:ascii="Calibri" w:hAnsi="Calibri"/>
                 <w:b/>
-                <w:color w:val="444A52"/>
+                <w:color w:val="1F1F1F"/>
                 <w:sz w:val="20"/>
               </w:rPr>
               <w:t>Dock K</w:t>
@@ -1926,12 +1984,12 @@
         </w:tc>
         <w:tc>
           <w:tcPr>
-            <w:tcW w:type="dxa" w:w="3402"/>
+            <w:tcW w:type="dxa" w:w="4819"/>
             <w:tcMar>
-              <w:top w:w="60" w:type="dxa"/>
-              <w:bottom w:w="60" w:type="dxa"/>
-              <w:start w:w="110" w:type="dxa"/>
-              <w:end w:w="110" w:type="dxa"/>
+              <w:top w:w="70" w:type="dxa"/>
+              <w:bottom w:w="70" w:type="dxa"/>
+              <w:start w:w="120" w:type="dxa"/>
+              <w:end w:w="120" w:type="dxa"/>
             </w:tcMar>
             <w:vAlign w:val="center"/>
           </w:tcPr>
@@ -1944,7 +2002,7 @@
               <w:rPr>
                 <w:rFonts w:ascii="Calibri" w:hAnsi="Calibri"/>
                 <w:b w:val="0"/>
-                <w:color w:val="444A52"/>
+                <w:color w:val="1F1F1F"/>
                 <w:sz w:val="20"/>
               </w:rPr>
               <w:t>16</w:t>
@@ -1955,13 +2013,13 @@
       <w:tr>
         <w:tc>
           <w:tcPr>
-            <w:tcW w:type="dxa" w:w="3402"/>
-            <w:shd w:val="clear" w:color="auto" w:fill="1C4E80"/>
+            <w:tcW w:type="dxa" w:w="4819"/>
+            <w:shd w:val="clear" w:color="auto" w:fill="111111"/>
             <w:tcMar>
-              <w:top w:w="60" w:type="dxa"/>
-              <w:bottom w:w="60" w:type="dxa"/>
-              <w:start w:w="110" w:type="dxa"/>
-              <w:end w:w="110" w:type="dxa"/>
+              <w:top w:w="70" w:type="dxa"/>
+              <w:bottom w:w="70" w:type="dxa"/>
+              <w:start w:w="120" w:type="dxa"/>
+              <w:end w:w="120" w:type="dxa"/>
             </w:tcMar>
             <w:vAlign w:val="center"/>
           </w:tcPr>
@@ -1974,7 +2032,7 @@
               <w:rPr>
                 <w:rFonts w:ascii="Calibri" w:hAnsi="Calibri"/>
                 <w:b/>
-                <w:color w:val="FFFFFF"/>
+                <w:color w:val="26B8EF"/>
                 <w:sz w:val="20"/>
               </w:rPr>
               <w:t>Total</w:t>
@@ -1983,13 +2041,13 @@
         </w:tc>
         <w:tc>
           <w:tcPr>
-            <w:tcW w:type="dxa" w:w="3402"/>
-            <w:shd w:val="clear" w:color="auto" w:fill="1C4E80"/>
+            <w:tcW w:type="dxa" w:w="4819"/>
+            <w:shd w:val="clear" w:color="auto" w:fill="111111"/>
             <w:tcMar>
-              <w:top w:w="60" w:type="dxa"/>
-              <w:bottom w:w="60" w:type="dxa"/>
-              <w:start w:w="110" w:type="dxa"/>
-              <w:end w:w="110" w:type="dxa"/>
+              <w:top w:w="70" w:type="dxa"/>
+              <w:bottom w:w="70" w:type="dxa"/>
+              <w:start w:w="120" w:type="dxa"/>
+              <w:end w:w="120" w:type="dxa"/>
             </w:tcMar>
             <w:vAlign w:val="center"/>
           </w:tcPr>
@@ -2002,7 +2060,7 @@
               <w:rPr>
                 <w:rFonts w:ascii="Calibri" w:hAnsi="Calibri"/>
                 <w:b/>
-                <w:color w:val="FFFFFF"/>
+                <w:color w:val="26B8EF"/>
                 <w:sz w:val="20"/>
               </w:rPr>
               <w:t>104 Joint Plates</w:t>
@@ -2016,42 +2074,66 @@
         <w:spacing w:after="40"/>
       </w:pPr>
     </w:p>
+    <w:tbl>
+      <w:tblPr>
+        <w:tblW w:type="auto" w:w="0"/>
+        <w:jc w:val="center"/>
+        <w:tblLook w:firstColumn="1" w:firstRow="1" w:lastColumn="0" w:lastRow="0" w:noHBand="0" w:noVBand="1" w:val="04A0"/>
+        <w:tblBorders>
+          <w:top w:val="none"/>
+          <w:left w:val="none"/>
+          <w:bottom w:val="none"/>
+          <w:right w:val="none"/>
+          <w:insideH w:val="none"/>
+          <w:insideV w:val="none"/>
+        </w:tblBorders>
+      </w:tblPr>
+      <w:tblGrid>
+        <w:gridCol w:w="9972"/>
+      </w:tblGrid>
+      <w:tr>
+        <w:tc>
+          <w:tcPr>
+            <w:tcW w:type="dxa" w:w="9972"/>
+            <w:shd w:val="clear" w:color="auto" w:fill="111111"/>
+            <w:tcMar>
+              <w:top w:w="90" w:type="dxa"/>
+              <w:bottom w:w="90" w:type="dxa"/>
+              <w:start w:w="140" w:type="dxa"/>
+              <w:end w:w="120" w:type="dxa"/>
+            </w:tcMar>
+            <w:tcBorders>
+              <w:start w:val="single" w:sz="22" w:space="0" w:color="26B8EF"/>
+            </w:tcBorders>
+          </w:tcPr>
+          <w:p>
+            <w:r>
+              <w:rPr>
+                <w:rFonts w:ascii="Calibri" w:hAnsi="Calibri"/>
+                <w:b/>
+                <w:color w:val="FFFFFF"/>
+                <w:sz w:val="23"/>
+              </w:rPr>
+              <w:t>6.  PONTOON SURFACE AND PILE REFURBISHMENT</w:t>
+            </w:r>
+          </w:p>
+        </w:tc>
+      </w:tr>
+    </w:tbl>
     <w:p>
       <w:pPr>
-        <w:keepNext/>
-        <w:spacing w:before="320" w:after="120"/>
-        <w:pBdr>
-          <w:bottom w:val="single" w:sz="12" w:space="4" w:color="1C4E80"/>
-        </w:pBdr>
-      </w:pPr>
-      <w:r>
-        <w:rPr>
-          <w:rFonts w:ascii="Calibri" w:hAnsi="Calibri"/>
-          <w:b/>
-          <w:color w:val="0E7690"/>
-          <w:sz w:val="28"/>
-        </w:rPr>
-        <w:t xml:space="preserve">6.  </w:t>
-      </w:r>
-      <w:r>
-        <w:rPr>
-          <w:rFonts w:ascii="Calibri" w:hAnsi="Calibri"/>
-          <w:b/>
-          <w:color w:val="0B1F3A"/>
-          <w:sz w:val="27"/>
-        </w:rPr>
-        <w:t>PONTOON SURFACE AND PILE REFURBISHMENT</w:t>
-      </w:r>
+        <w:spacing w:after="40"/>
+      </w:pPr>
     </w:p>
     <w:p>
       <w:pPr>
-        <w:spacing w:before="40" w:after="120"/>
+        <w:spacing w:after="120"/>
       </w:pPr>
       <w:r>
         <w:rPr>
           <w:b/>
           <w:i/>
-          <w:color w:val="0E7690"/>
+          <w:color w:val="26B8EF"/>
           <w:sz w:val="19"/>
         </w:rPr>
         <w:t xml:space="preserve">Applicable to:  </w:t>
@@ -2059,16 +2141,19 @@
       <w:r>
         <w:rPr>
           <w:i/>
-          <w:color w:val="444A52"/>
+          <w:color w:val="3A3A3A"/>
           <w:sz w:val="19"/>
         </w:rPr>
         <w:t>Dock A, B, C, K &amp; Slipway Pontoon</w:t>
       </w:r>
     </w:p>
     <w:p>
+      <w:pPr>
+        <w:jc w:val="both"/>
+      </w:pPr>
       <w:r>
         <w:rPr>
-          <w:color w:val="444A52"/>
+          <w:color w:val="1F1F1F"/>
           <w:sz w:val="21"/>
         </w:rPr>
         <w:t>The Contractor shall:</w:t>
@@ -2082,7 +2167,7 @@
       </w:pPr>
       <w:r>
         <w:rPr>
-          <w:color w:val="444A52"/>
+          <w:color w:val="1F1F1F"/>
           <w:sz w:val="21"/>
         </w:rPr>
         <w:t>Prepare all pontoon surfaces.</w:t>
@@ -2096,7 +2181,7 @@
       </w:pPr>
       <w:r>
         <w:rPr>
-          <w:color w:val="444A52"/>
+          <w:color w:val="1F1F1F"/>
           <w:sz w:val="21"/>
         </w:rPr>
         <w:t>Remove loose coatings and corrosion.</w:t>
@@ -2110,7 +2195,7 @@
       </w:pPr>
       <w:r>
         <w:rPr>
-          <w:color w:val="444A52"/>
+          <w:color w:val="1F1F1F"/>
           <w:sz w:val="21"/>
         </w:rPr>
         <w:t>Apply approved marine coating system.</w:t>
@@ -2124,7 +2209,7 @@
       </w:pPr>
       <w:r>
         <w:rPr>
-          <w:color w:val="444A52"/>
+          <w:color w:val="1F1F1F"/>
           <w:sz w:val="21"/>
         </w:rPr>
         <w:t>Repaint all pontoon surfaces.</w:t>
@@ -2138,7 +2223,7 @@
       </w:pPr>
       <w:r>
         <w:rPr>
-          <w:color w:val="444A52"/>
+          <w:color w:val="1F1F1F"/>
           <w:sz w:val="21"/>
         </w:rPr>
         <w:t>Prepare and repaint marina piles.</w:t>
@@ -2152,43 +2237,70 @@
       </w:pPr>
       <w:r>
         <w:rPr>
-          <w:color w:val="444A52"/>
+          <w:color w:val="1F1F1F"/>
           <w:sz w:val="21"/>
         </w:rPr>
         <w:t>Provide coating system data sheets and warranty information.</w:t>
       </w:r>
     </w:p>
+    <w:tbl>
+      <w:tblPr>
+        <w:tblW w:type="auto" w:w="0"/>
+        <w:jc w:val="center"/>
+        <w:tblLook w:firstColumn="1" w:firstRow="1" w:lastColumn="0" w:lastRow="0" w:noHBand="0" w:noVBand="1" w:val="04A0"/>
+        <w:tblBorders>
+          <w:top w:val="none"/>
+          <w:left w:val="none"/>
+          <w:bottom w:val="none"/>
+          <w:right w:val="none"/>
+          <w:insideH w:val="none"/>
+          <w:insideV w:val="none"/>
+        </w:tblBorders>
+      </w:tblPr>
+      <w:tblGrid>
+        <w:gridCol w:w="9972"/>
+      </w:tblGrid>
+      <w:tr>
+        <w:tc>
+          <w:tcPr>
+            <w:tcW w:type="dxa" w:w="9972"/>
+            <w:shd w:val="clear" w:color="auto" w:fill="111111"/>
+            <w:tcMar>
+              <w:top w:w="90" w:type="dxa"/>
+              <w:bottom w:w="90" w:type="dxa"/>
+              <w:start w:w="140" w:type="dxa"/>
+              <w:end w:w="120" w:type="dxa"/>
+            </w:tcMar>
+            <w:tcBorders>
+              <w:start w:val="single" w:sz="22" w:space="0" w:color="26B8EF"/>
+            </w:tcBorders>
+          </w:tcPr>
+          <w:p>
+            <w:r>
+              <w:rPr>
+                <w:rFonts w:ascii="Calibri" w:hAnsi="Calibri"/>
+                <w:b/>
+                <w:color w:val="FFFFFF"/>
+                <w:sz w:val="23"/>
+              </w:rPr>
+              <w:t>7.  FIBERGLASS PILE CAP REPLACEMENT</w:t>
+            </w:r>
+          </w:p>
+        </w:tc>
+      </w:tr>
+    </w:tbl>
     <w:p>
       <w:pPr>
-        <w:keepNext/>
-        <w:spacing w:before="320" w:after="120"/>
-        <w:pBdr>
-          <w:bottom w:val="single" w:sz="12" w:space="4" w:color="1C4E80"/>
-        </w:pBdr>
+        <w:spacing w:after="40"/>
+      </w:pPr>
+    </w:p>
+    <w:p>
+      <w:pPr>
+        <w:jc w:val="both"/>
       </w:pPr>
       <w:r>
         <w:rPr>
-          <w:rFonts w:ascii="Calibri" w:hAnsi="Calibri"/>
-          <w:b/>
-          <w:color w:val="0E7690"/>
-          <w:sz w:val="28"/>
-        </w:rPr>
-        <w:t xml:space="preserve">7.  </w:t>
-      </w:r>
-      <w:r>
-        <w:rPr>
-          <w:rFonts w:ascii="Calibri" w:hAnsi="Calibri"/>
-          <w:b/>
-          <w:color w:val="0B1F3A"/>
-          <w:sz w:val="27"/>
-        </w:rPr>
-        <w:t>FIBERGLASS PILE CAP REPLACEMENT</w:t>
-      </w:r>
-    </w:p>
-    <w:p>
-      <w:r>
-        <w:rPr>
-          <w:color w:val="444A52"/>
+          <w:color w:val="1F1F1F"/>
           <w:sz w:val="21"/>
         </w:rPr>
         <w:t>The Contractor shall supply and install new fiberglass pile caps as follows:</w:t>
@@ -2200,28 +2312,28 @@
         <w:jc w:val="left"/>
         <w:tblLook w:firstColumn="1" w:firstRow="1" w:lastColumn="0" w:lastRow="0" w:noHBand="0" w:noVBand="1" w:val="04A0"/>
         <w:tblBorders>
-          <w:top w:val="single" w:sz="6" w:space="0" w:color="D5DEE7"/>
-          <w:left w:val="single" w:sz="6" w:space="0" w:color="D5DEE7"/>
-          <w:bottom w:val="single" w:sz="6" w:space="0" w:color="D5DEE7"/>
-          <w:right w:val="single" w:sz="6" w:space="0" w:color="D5DEE7"/>
-          <w:insideH w:val="single" w:sz="6" w:space="0" w:color="D5DEE7"/>
-          <w:insideV w:val="single" w:sz="6" w:space="0" w:color="D5DEE7"/>
+          <w:top w:val="single" w:sz="6" w:space="0" w:color="CFCFCF"/>
+          <w:left w:val="single" w:sz="6" w:space="0" w:color="CFCFCF"/>
+          <w:bottom w:val="single" w:sz="6" w:space="0" w:color="CFCFCF"/>
+          <w:right w:val="single" w:sz="6" w:space="0" w:color="CFCFCF"/>
+          <w:insideH w:val="single" w:sz="6" w:space="0" w:color="CFCFCF"/>
+          <w:insideV w:val="single" w:sz="6" w:space="0" w:color="CFCFCF"/>
         </w:tblBorders>
       </w:tblPr>
       <w:tblGrid>
-        <w:gridCol w:w="4873"/>
-        <w:gridCol w:w="4873"/>
+        <w:gridCol w:w="4986"/>
+        <w:gridCol w:w="4986"/>
       </w:tblGrid>
       <w:tr>
         <w:tc>
           <w:tcPr>
-            <w:tcW w:type="dxa" w:w="3402"/>
-            <w:shd w:val="clear" w:color="auto" w:fill="0B1F3A"/>
+            <w:tcW w:type="dxa" w:w="4819"/>
+            <w:shd w:val="clear" w:color="auto" w:fill="111111"/>
             <w:tcMar>
-              <w:top w:w="60" w:type="dxa"/>
-              <w:bottom w:w="60" w:type="dxa"/>
-              <w:start w:w="110" w:type="dxa"/>
-              <w:end w:w="110" w:type="dxa"/>
+              <w:top w:w="70" w:type="dxa"/>
+              <w:bottom w:w="70" w:type="dxa"/>
+              <w:start w:w="120" w:type="dxa"/>
+              <w:end w:w="120" w:type="dxa"/>
             </w:tcMar>
             <w:vAlign w:val="center"/>
           </w:tcPr>
@@ -2243,13 +2355,13 @@
         </w:tc>
         <w:tc>
           <w:tcPr>
-            <w:tcW w:type="dxa" w:w="3402"/>
-            <w:shd w:val="clear" w:color="auto" w:fill="0B1F3A"/>
+            <w:tcW w:type="dxa" w:w="4819"/>
+            <w:shd w:val="clear" w:color="auto" w:fill="111111"/>
             <w:tcMar>
-              <w:top w:w="60" w:type="dxa"/>
-              <w:bottom w:w="60" w:type="dxa"/>
-              <w:start w:w="110" w:type="dxa"/>
-              <w:end w:w="110" w:type="dxa"/>
+              <w:top w:w="70" w:type="dxa"/>
+              <w:bottom w:w="70" w:type="dxa"/>
+              <w:start w:w="120" w:type="dxa"/>
+              <w:end w:w="120" w:type="dxa"/>
             </w:tcMar>
             <w:vAlign w:val="center"/>
           </w:tcPr>
@@ -2273,12 +2385,12 @@
       <w:tr>
         <w:tc>
           <w:tcPr>
-            <w:tcW w:type="dxa" w:w="3402"/>
+            <w:tcW w:type="dxa" w:w="4819"/>
             <w:tcMar>
-              <w:top w:w="60" w:type="dxa"/>
-              <w:bottom w:w="60" w:type="dxa"/>
-              <w:start w:w="110" w:type="dxa"/>
-              <w:end w:w="110" w:type="dxa"/>
+              <w:top w:w="70" w:type="dxa"/>
+              <w:bottom w:w="70" w:type="dxa"/>
+              <w:start w:w="120" w:type="dxa"/>
+              <w:end w:w="120" w:type="dxa"/>
             </w:tcMar>
             <w:vAlign w:val="center"/>
           </w:tcPr>
@@ -2291,7 +2403,7 @@
               <w:rPr>
                 <w:rFonts w:ascii="Calibri" w:hAnsi="Calibri"/>
                 <w:b/>
-                <w:color w:val="444A52"/>
+                <w:color w:val="1F1F1F"/>
                 <w:sz w:val="20"/>
               </w:rPr>
               <w:t>Dock A</w:t>
@@ -2300,12 +2412,12 @@
         </w:tc>
         <w:tc>
           <w:tcPr>
-            <w:tcW w:type="dxa" w:w="3402"/>
+            <w:tcW w:type="dxa" w:w="4819"/>
             <w:tcMar>
-              <w:top w:w="60" w:type="dxa"/>
-              <w:bottom w:w="60" w:type="dxa"/>
-              <w:start w:w="110" w:type="dxa"/>
-              <w:end w:w="110" w:type="dxa"/>
+              <w:top w:w="70" w:type="dxa"/>
+              <w:bottom w:w="70" w:type="dxa"/>
+              <w:start w:w="120" w:type="dxa"/>
+              <w:end w:w="120" w:type="dxa"/>
             </w:tcMar>
             <w:vAlign w:val="center"/>
           </w:tcPr>
@@ -2318,7 +2430,7 @@
               <w:rPr>
                 <w:rFonts w:ascii="Calibri" w:hAnsi="Calibri"/>
                 <w:b w:val="0"/>
-                <w:color w:val="444A52"/>
+                <w:color w:val="1F1F1F"/>
                 <w:sz w:val="20"/>
               </w:rPr>
               <w:t>9</w:t>
@@ -2329,13 +2441,13 @@
       <w:tr>
         <w:tc>
           <w:tcPr>
-            <w:tcW w:type="dxa" w:w="3402"/>
-            <w:shd w:val="clear" w:color="auto" w:fill="EAF1F7"/>
+            <w:tcW w:type="dxa" w:w="4819"/>
+            <w:shd w:val="clear" w:color="auto" w:fill="F2F2F2"/>
             <w:tcMar>
-              <w:top w:w="60" w:type="dxa"/>
-              <w:bottom w:w="60" w:type="dxa"/>
-              <w:start w:w="110" w:type="dxa"/>
-              <w:end w:w="110" w:type="dxa"/>
+              <w:top w:w="70" w:type="dxa"/>
+              <w:bottom w:w="70" w:type="dxa"/>
+              <w:start w:w="120" w:type="dxa"/>
+              <w:end w:w="120" w:type="dxa"/>
             </w:tcMar>
             <w:vAlign w:val="center"/>
           </w:tcPr>
@@ -2348,7 +2460,7 @@
               <w:rPr>
                 <w:rFonts w:ascii="Calibri" w:hAnsi="Calibri"/>
                 <w:b/>
-                <w:color w:val="444A52"/>
+                <w:color w:val="1F1F1F"/>
                 <w:sz w:val="20"/>
               </w:rPr>
               <w:t>Dock B</w:t>
@@ -2357,13 +2469,13 @@
         </w:tc>
         <w:tc>
           <w:tcPr>
-            <w:tcW w:type="dxa" w:w="3402"/>
-            <w:shd w:val="clear" w:color="auto" w:fill="EAF1F7"/>
+            <w:tcW w:type="dxa" w:w="4819"/>
+            <w:shd w:val="clear" w:color="auto" w:fill="F2F2F2"/>
             <w:tcMar>
-              <w:top w:w="60" w:type="dxa"/>
-              <w:bottom w:w="60" w:type="dxa"/>
-              <w:start w:w="110" w:type="dxa"/>
-              <w:end w:w="110" w:type="dxa"/>
+              <w:top w:w="70" w:type="dxa"/>
+              <w:bottom w:w="70" w:type="dxa"/>
+              <w:start w:w="120" w:type="dxa"/>
+              <w:end w:w="120" w:type="dxa"/>
             </w:tcMar>
             <w:vAlign w:val="center"/>
           </w:tcPr>
@@ -2376,7 +2488,7 @@
               <w:rPr>
                 <w:rFonts w:ascii="Calibri" w:hAnsi="Calibri"/>
                 <w:b w:val="0"/>
-                <w:color w:val="444A52"/>
+                <w:color w:val="1F1F1F"/>
                 <w:sz w:val="20"/>
               </w:rPr>
               <w:t>13</w:t>
@@ -2387,12 +2499,12 @@
       <w:tr>
         <w:tc>
           <w:tcPr>
-            <w:tcW w:type="dxa" w:w="3402"/>
+            <w:tcW w:type="dxa" w:w="4819"/>
             <w:tcMar>
-              <w:top w:w="60" w:type="dxa"/>
-              <w:bottom w:w="60" w:type="dxa"/>
-              <w:start w:w="110" w:type="dxa"/>
-              <w:end w:w="110" w:type="dxa"/>
+              <w:top w:w="70" w:type="dxa"/>
+              <w:bottom w:w="70" w:type="dxa"/>
+              <w:start w:w="120" w:type="dxa"/>
+              <w:end w:w="120" w:type="dxa"/>
             </w:tcMar>
             <w:vAlign w:val="center"/>
           </w:tcPr>
@@ -2405,7 +2517,7 @@
               <w:rPr>
                 <w:rFonts w:ascii="Calibri" w:hAnsi="Calibri"/>
                 <w:b/>
-                <w:color w:val="444A52"/>
+                <w:color w:val="1F1F1F"/>
                 <w:sz w:val="20"/>
               </w:rPr>
               <w:t>Dock C</w:t>
@@ -2414,12 +2526,12 @@
         </w:tc>
         <w:tc>
           <w:tcPr>
-            <w:tcW w:type="dxa" w:w="3402"/>
+            <w:tcW w:type="dxa" w:w="4819"/>
             <w:tcMar>
-              <w:top w:w="60" w:type="dxa"/>
-              <w:bottom w:w="60" w:type="dxa"/>
-              <w:start w:w="110" w:type="dxa"/>
-              <w:end w:w="110" w:type="dxa"/>
+              <w:top w:w="70" w:type="dxa"/>
+              <w:bottom w:w="70" w:type="dxa"/>
+              <w:start w:w="120" w:type="dxa"/>
+              <w:end w:w="120" w:type="dxa"/>
             </w:tcMar>
             <w:vAlign w:val="center"/>
           </w:tcPr>
@@ -2432,7 +2544,7 @@
               <w:rPr>
                 <w:rFonts w:ascii="Calibri" w:hAnsi="Calibri"/>
                 <w:b w:val="0"/>
-                <w:color w:val="444A52"/>
+                <w:color w:val="1F1F1F"/>
                 <w:sz w:val="20"/>
               </w:rPr>
               <w:t>9</w:t>
@@ -2443,13 +2555,13 @@
       <w:tr>
         <w:tc>
           <w:tcPr>
-            <w:tcW w:type="dxa" w:w="3402"/>
-            <w:shd w:val="clear" w:color="auto" w:fill="EAF1F7"/>
+            <w:tcW w:type="dxa" w:w="4819"/>
+            <w:shd w:val="clear" w:color="auto" w:fill="F2F2F2"/>
             <w:tcMar>
-              <w:top w:w="60" w:type="dxa"/>
-              <w:bottom w:w="60" w:type="dxa"/>
-              <w:start w:w="110" w:type="dxa"/>
-              <w:end w:w="110" w:type="dxa"/>
+              <w:top w:w="70" w:type="dxa"/>
+              <w:bottom w:w="70" w:type="dxa"/>
+              <w:start w:w="120" w:type="dxa"/>
+              <w:end w:w="120" w:type="dxa"/>
             </w:tcMar>
             <w:vAlign w:val="center"/>
           </w:tcPr>
@@ -2462,7 +2574,7 @@
               <w:rPr>
                 <w:rFonts w:ascii="Calibri" w:hAnsi="Calibri"/>
                 <w:b/>
-                <w:color w:val="444A52"/>
+                <w:color w:val="1F1F1F"/>
                 <w:sz w:val="20"/>
               </w:rPr>
               <w:t>Dock D</w:t>
@@ -2471,13 +2583,13 @@
         </w:tc>
         <w:tc>
           <w:tcPr>
-            <w:tcW w:type="dxa" w:w="3402"/>
-            <w:shd w:val="clear" w:color="auto" w:fill="EAF1F7"/>
+            <w:tcW w:type="dxa" w:w="4819"/>
+            <w:shd w:val="clear" w:color="auto" w:fill="F2F2F2"/>
             <w:tcMar>
-              <w:top w:w="60" w:type="dxa"/>
-              <w:bottom w:w="60" w:type="dxa"/>
-              <w:start w:w="110" w:type="dxa"/>
-              <w:end w:w="110" w:type="dxa"/>
+              <w:top w:w="70" w:type="dxa"/>
+              <w:bottom w:w="70" w:type="dxa"/>
+              <w:start w:w="120" w:type="dxa"/>
+              <w:end w:w="120" w:type="dxa"/>
             </w:tcMar>
             <w:vAlign w:val="center"/>
           </w:tcPr>
@@ -2490,7 +2602,7 @@
               <w:rPr>
                 <w:rFonts w:ascii="Calibri" w:hAnsi="Calibri"/>
                 <w:b w:val="0"/>
-                <w:color w:val="444A52"/>
+                <w:color w:val="1F1F1F"/>
                 <w:sz w:val="20"/>
               </w:rPr>
               <w:t>9</w:t>
@@ -2501,12 +2613,12 @@
       <w:tr>
         <w:tc>
           <w:tcPr>
-            <w:tcW w:type="dxa" w:w="3402"/>
+            <w:tcW w:type="dxa" w:w="4819"/>
             <w:tcMar>
-              <w:top w:w="60" w:type="dxa"/>
-              <w:bottom w:w="60" w:type="dxa"/>
-              <w:start w:w="110" w:type="dxa"/>
-              <w:end w:w="110" w:type="dxa"/>
+              <w:top w:w="70" w:type="dxa"/>
+              <w:bottom w:w="70" w:type="dxa"/>
+              <w:start w:w="120" w:type="dxa"/>
+              <w:end w:w="120" w:type="dxa"/>
             </w:tcMar>
             <w:vAlign w:val="center"/>
           </w:tcPr>
@@ -2519,7 +2631,7 @@
               <w:rPr>
                 <w:rFonts w:ascii="Calibri" w:hAnsi="Calibri"/>
                 <w:b/>
-                <w:color w:val="444A52"/>
+                <w:color w:val="1F1F1F"/>
                 <w:sz w:val="20"/>
               </w:rPr>
               <w:t>Dock K</w:t>
@@ -2528,12 +2640,12 @@
         </w:tc>
         <w:tc>
           <w:tcPr>
-            <w:tcW w:type="dxa" w:w="3402"/>
+            <w:tcW w:type="dxa" w:w="4819"/>
             <w:tcMar>
-              <w:top w:w="60" w:type="dxa"/>
-              <w:bottom w:w="60" w:type="dxa"/>
-              <w:start w:w="110" w:type="dxa"/>
-              <w:end w:w="110" w:type="dxa"/>
+              <w:top w:w="70" w:type="dxa"/>
+              <w:bottom w:w="70" w:type="dxa"/>
+              <w:start w:w="120" w:type="dxa"/>
+              <w:end w:w="120" w:type="dxa"/>
             </w:tcMar>
             <w:vAlign w:val="center"/>
           </w:tcPr>
@@ -2546,7 +2658,7 @@
               <w:rPr>
                 <w:rFonts w:ascii="Calibri" w:hAnsi="Calibri"/>
                 <w:b w:val="0"/>
-                <w:color w:val="444A52"/>
+                <w:color w:val="1F1F1F"/>
                 <w:sz w:val="20"/>
               </w:rPr>
               <w:t>5</w:t>
@@ -2557,13 +2669,13 @@
       <w:tr>
         <w:tc>
           <w:tcPr>
-            <w:tcW w:type="dxa" w:w="3402"/>
-            <w:shd w:val="clear" w:color="auto" w:fill="1C4E80"/>
+            <w:tcW w:type="dxa" w:w="4819"/>
+            <w:shd w:val="clear" w:color="auto" w:fill="111111"/>
             <w:tcMar>
-              <w:top w:w="60" w:type="dxa"/>
-              <w:bottom w:w="60" w:type="dxa"/>
-              <w:start w:w="110" w:type="dxa"/>
-              <w:end w:w="110" w:type="dxa"/>
+              <w:top w:w="70" w:type="dxa"/>
+              <w:bottom w:w="70" w:type="dxa"/>
+              <w:start w:w="120" w:type="dxa"/>
+              <w:end w:w="120" w:type="dxa"/>
             </w:tcMar>
             <w:vAlign w:val="center"/>
           </w:tcPr>
@@ -2576,7 +2688,7 @@
               <w:rPr>
                 <w:rFonts w:ascii="Calibri" w:hAnsi="Calibri"/>
                 <w:b/>
-                <w:color w:val="FFFFFF"/>
+                <w:color w:val="26B8EF"/>
                 <w:sz w:val="20"/>
               </w:rPr>
               <w:t>Total</w:t>
@@ -2585,13 +2697,13 @@
         </w:tc>
         <w:tc>
           <w:tcPr>
-            <w:tcW w:type="dxa" w:w="3402"/>
-            <w:shd w:val="clear" w:color="auto" w:fill="1C4E80"/>
+            <w:tcW w:type="dxa" w:w="4819"/>
+            <w:shd w:val="clear" w:color="auto" w:fill="111111"/>
             <w:tcMar>
-              <w:top w:w="60" w:type="dxa"/>
-              <w:bottom w:w="60" w:type="dxa"/>
-              <w:start w:w="110" w:type="dxa"/>
-              <w:end w:w="110" w:type="dxa"/>
+              <w:top w:w="70" w:type="dxa"/>
+              <w:bottom w:w="70" w:type="dxa"/>
+              <w:start w:w="120" w:type="dxa"/>
+              <w:end w:w="120" w:type="dxa"/>
             </w:tcMar>
             <w:vAlign w:val="center"/>
           </w:tcPr>
@@ -2604,7 +2716,7 @@
               <w:rPr>
                 <w:rFonts w:ascii="Calibri" w:hAnsi="Calibri"/>
                 <w:b/>
-                <w:color w:val="FFFFFF"/>
+                <w:color w:val="26B8EF"/>
                 <w:sz w:val="20"/>
               </w:rPr>
               <w:t>45 Pile Caps</w:t>
@@ -2619,9 +2731,12 @@
       </w:pPr>
     </w:p>
     <w:p>
+      <w:pPr>
+        <w:jc w:val="both"/>
+      </w:pPr>
       <w:r>
         <w:rPr>
-          <w:color w:val="444A52"/>
+          <w:color w:val="1F1F1F"/>
           <w:sz w:val="21"/>
         </w:rPr>
         <w:t>The Contractor shall:</w:t>
@@ -2635,7 +2750,7 @@
       </w:pPr>
       <w:r>
         <w:rPr>
-          <w:color w:val="444A52"/>
+          <w:color w:val="1F1F1F"/>
           <w:sz w:val="21"/>
         </w:rPr>
         <w:t>Remove existing damaged pile caps.</w:t>
@@ -2649,7 +2764,7 @@
       </w:pPr>
       <w:r>
         <w:rPr>
-          <w:color w:val="444A52"/>
+          <w:color w:val="1F1F1F"/>
           <w:sz w:val="21"/>
         </w:rPr>
         <w:t>Supply marine-grade fiberglass pile caps.</w:t>
@@ -2663,48 +2778,72 @@
       </w:pPr>
       <w:r>
         <w:rPr>
-          <w:color w:val="444A52"/>
+          <w:color w:val="1F1F1F"/>
           <w:sz w:val="21"/>
         </w:rPr>
         <w:t>Install and secure pile caps in accordance with manufacturer recommendations.</w:t>
       </w:r>
     </w:p>
+    <w:tbl>
+      <w:tblPr>
+        <w:tblW w:type="auto" w:w="0"/>
+        <w:jc w:val="center"/>
+        <w:tblLook w:firstColumn="1" w:firstRow="1" w:lastColumn="0" w:lastRow="0" w:noHBand="0" w:noVBand="1" w:val="04A0"/>
+        <w:tblBorders>
+          <w:top w:val="none"/>
+          <w:left w:val="none"/>
+          <w:bottom w:val="none"/>
+          <w:right w:val="none"/>
+          <w:insideH w:val="none"/>
+          <w:insideV w:val="none"/>
+        </w:tblBorders>
+      </w:tblPr>
+      <w:tblGrid>
+        <w:gridCol w:w="9972"/>
+      </w:tblGrid>
+      <w:tr>
+        <w:tc>
+          <w:tcPr>
+            <w:tcW w:type="dxa" w:w="9972"/>
+            <w:shd w:val="clear" w:color="auto" w:fill="111111"/>
+            <w:tcMar>
+              <w:top w:w="90" w:type="dxa"/>
+              <w:bottom w:w="90" w:type="dxa"/>
+              <w:start w:w="140" w:type="dxa"/>
+              <w:end w:w="120" w:type="dxa"/>
+            </w:tcMar>
+            <w:tcBorders>
+              <w:start w:val="single" w:sz="22" w:space="0" w:color="26B8EF"/>
+            </w:tcBorders>
+          </w:tcPr>
+          <w:p>
+            <w:r>
+              <w:rPr>
+                <w:rFonts w:ascii="Calibri" w:hAnsi="Calibri"/>
+                <w:b/>
+                <w:color w:val="FFFFFF"/>
+                <w:sz w:val="23"/>
+              </w:rPr>
+              <w:t>8.  PILE BRACKET AND WEAR PAD REPAIRS</w:t>
+            </w:r>
+          </w:p>
+        </w:tc>
+      </w:tr>
+    </w:tbl>
     <w:p>
       <w:pPr>
-        <w:keepNext/>
-        <w:spacing w:before="320" w:after="120"/>
-        <w:pBdr>
-          <w:bottom w:val="single" w:sz="12" w:space="4" w:color="1C4E80"/>
-        </w:pBdr>
-      </w:pPr>
-      <w:r>
-        <w:rPr>
-          <w:rFonts w:ascii="Calibri" w:hAnsi="Calibri"/>
-          <w:b/>
-          <w:color w:val="0E7690"/>
-          <w:sz w:val="28"/>
-        </w:rPr>
-        <w:t xml:space="preserve">8.  </w:t>
-      </w:r>
-      <w:r>
-        <w:rPr>
-          <w:rFonts w:ascii="Calibri" w:hAnsi="Calibri"/>
-          <w:b/>
-          <w:color w:val="0B1F3A"/>
-          <w:sz w:val="27"/>
-        </w:rPr>
-        <w:t>PILE BRACKET AND WEAR PAD REPAIRS</w:t>
-      </w:r>
+        <w:spacing w:after="40"/>
+      </w:pPr>
     </w:p>
     <w:p>
       <w:pPr>
-        <w:spacing w:before="40" w:after="120"/>
+        <w:spacing w:after="120"/>
       </w:pPr>
       <w:r>
         <w:rPr>
           <w:b/>
           <w:i/>
-          <w:color w:val="0E7690"/>
+          <w:color w:val="26B8EF"/>
           <w:sz w:val="19"/>
         </w:rPr>
         <w:t xml:space="preserve">Applicable to:  </w:t>
@@ -2712,16 +2851,19 @@
       <w:r>
         <w:rPr>
           <w:i/>
-          <w:color w:val="444A52"/>
+          <w:color w:val="3A3A3A"/>
           <w:sz w:val="19"/>
         </w:rPr>
         <w:t>Dock D &amp; K</w:t>
       </w:r>
     </w:p>
     <w:p>
+      <w:pPr>
+        <w:jc w:val="both"/>
+      </w:pPr>
       <w:r>
         <w:rPr>
-          <w:color w:val="444A52"/>
+          <w:color w:val="1F1F1F"/>
           <w:sz w:val="21"/>
         </w:rPr>
         <w:t>The Contractor shall:</w:t>
@@ -2735,7 +2877,7 @@
       </w:pPr>
       <w:r>
         <w:rPr>
-          <w:color w:val="444A52"/>
+          <w:color w:val="1F1F1F"/>
           <w:sz w:val="21"/>
         </w:rPr>
         <w:t>Remove damaged wear pads.</w:t>
@@ -2749,7 +2891,7 @@
       </w:pPr>
       <w:r>
         <w:rPr>
-          <w:color w:val="444A52"/>
+          <w:color w:val="1F1F1F"/>
           <w:sz w:val="21"/>
         </w:rPr>
         <w:t>Supply and install replacement wear pads.</w:t>
@@ -2763,7 +2905,7 @@
       </w:pPr>
       <w:r>
         <w:rPr>
-          <w:color w:val="444A52"/>
+          <w:color w:val="1F1F1F"/>
           <w:sz w:val="21"/>
         </w:rPr>
         <w:t>Adjust pile bracket fixing hole alignment.</w:t>
@@ -2777,7 +2919,7 @@
       </w:pPr>
       <w:r>
         <w:rPr>
-          <w:color w:val="444A52"/>
+          <w:color w:val="1F1F1F"/>
           <w:sz w:val="21"/>
         </w:rPr>
         <w:t>Rectify bracket positioning to prevent premature wear.</w:t>
@@ -2791,7 +2933,7 @@
       </w:pPr>
       <w:r>
         <w:rPr>
-          <w:color w:val="444A52"/>
+          <w:color w:val="1F1F1F"/>
           <w:sz w:val="21"/>
         </w:rPr>
         <w:t>Supply spare wear pads for future maintenance.</w:t>
@@ -2804,7 +2946,7 @@
       <w:r>
         <w:rPr>
           <w:b/>
-          <w:color w:val="0B1F3A"/>
+          <w:color w:val="1F1F1F"/>
           <w:sz w:val="20"/>
         </w:rPr>
         <w:t>Minimum Quantity</w:t>
@@ -2818,43 +2960,70 @@
       </w:pPr>
       <w:r>
         <w:rPr>
-          <w:color w:val="444A52"/>
+          <w:color w:val="1F1F1F"/>
           <w:sz w:val="21"/>
         </w:rPr>
         <w:t>10 wear pads per dock, inclusive of spare stock.</w:t>
       </w:r>
     </w:p>
+    <w:tbl>
+      <w:tblPr>
+        <w:tblW w:type="auto" w:w="0"/>
+        <w:jc w:val="center"/>
+        <w:tblLook w:firstColumn="1" w:firstRow="1" w:lastColumn="0" w:lastRow="0" w:noHBand="0" w:noVBand="1" w:val="04A0"/>
+        <w:tblBorders>
+          <w:top w:val="none"/>
+          <w:left w:val="none"/>
+          <w:bottom w:val="none"/>
+          <w:right w:val="none"/>
+          <w:insideH w:val="none"/>
+          <w:insideV w:val="none"/>
+        </w:tblBorders>
+      </w:tblPr>
+      <w:tblGrid>
+        <w:gridCol w:w="9972"/>
+      </w:tblGrid>
+      <w:tr>
+        <w:tc>
+          <w:tcPr>
+            <w:tcW w:type="dxa" w:w="9972"/>
+            <w:shd w:val="clear" w:color="auto" w:fill="111111"/>
+            <w:tcMar>
+              <w:top w:w="90" w:type="dxa"/>
+              <w:bottom w:w="90" w:type="dxa"/>
+              <w:start w:w="140" w:type="dxa"/>
+              <w:end w:w="120" w:type="dxa"/>
+            </w:tcMar>
+            <w:tcBorders>
+              <w:start w:val="single" w:sz="22" w:space="0" w:color="26B8EF"/>
+            </w:tcBorders>
+          </w:tcPr>
+          <w:p>
+            <w:r>
+              <w:rPr>
+                <w:rFonts w:ascii="Calibri" w:hAnsi="Calibri"/>
+                <w:b/>
+                <w:color w:val="FFFFFF"/>
+                <w:sz w:val="23"/>
+              </w:rPr>
+              <w:t>9.  MAIN WAVE BREAKER AND NAVIGATION POLE REHABILITATION</w:t>
+            </w:r>
+          </w:p>
+        </w:tc>
+      </w:tr>
+    </w:tbl>
     <w:p>
       <w:pPr>
-        <w:keepNext/>
-        <w:spacing w:before="320" w:after="120"/>
-        <w:pBdr>
-          <w:bottom w:val="single" w:sz="12" w:space="4" w:color="1C4E80"/>
-        </w:pBdr>
+        <w:spacing w:after="40"/>
+      </w:pPr>
+    </w:p>
+    <w:p>
+      <w:pPr>
+        <w:jc w:val="both"/>
       </w:pPr>
       <w:r>
         <w:rPr>
-          <w:rFonts w:ascii="Calibri" w:hAnsi="Calibri"/>
-          <w:b/>
-          <w:color w:val="0E7690"/>
-          <w:sz w:val="28"/>
-        </w:rPr>
-        <w:t xml:space="preserve">9.  </w:t>
-      </w:r>
-      <w:r>
-        <w:rPr>
-          <w:rFonts w:ascii="Calibri" w:hAnsi="Calibri"/>
-          <w:b/>
-          <w:color w:val="0B1F3A"/>
-          <w:sz w:val="27"/>
-        </w:rPr>
-        <w:t>MAIN WAVE BREAKER AND NAVIGATION POLE REHABILITATION</w:t>
-      </w:r>
-    </w:p>
-    <w:p>
-      <w:r>
-        <w:rPr>
-          <w:color w:val="444A52"/>
+          <w:color w:val="1F1F1F"/>
           <w:sz w:val="21"/>
         </w:rPr>
         <w:t>The Contractor shall carry out the following works:</w:t>
@@ -2868,19 +3037,10 @@
       <w:r>
         <w:rPr>
           <w:b/>
-          <w:color w:val="1C4E80"/>
+          <w:color w:val="26B8EF"/>
           <w:sz w:val="22"/>
         </w:rPr>
-        <w:t xml:space="preserve">9.1  </w:t>
-      </w:r>
-      <w:r>
-        <w:rPr>
-          <w:rFonts w:ascii="Calibri" w:hAnsi="Calibri"/>
-          <w:b/>
-          <w:color w:val="1C4E80"/>
-          <w:sz w:val="22"/>
-        </w:rPr>
-        <w:t>Wave Breaker</w:t>
+        <w:t>9.1  Wave Breaker</w:t>
       </w:r>
     </w:p>
     <w:p>
@@ -2891,7 +3051,7 @@
       </w:pPr>
       <w:r>
         <w:rPr>
-          <w:color w:val="444A52"/>
+          <w:color w:val="1F1F1F"/>
           <w:sz w:val="21"/>
         </w:rPr>
         <w:t>Prepare exposed steel surfaces.</w:t>
@@ -2905,7 +3065,7 @@
       </w:pPr>
       <w:r>
         <w:rPr>
-          <w:color w:val="444A52"/>
+          <w:color w:val="1F1F1F"/>
           <w:sz w:val="21"/>
         </w:rPr>
         <w:t>Remove corrosion.</w:t>
@@ -2919,7 +3079,7 @@
       </w:pPr>
       <w:r>
         <w:rPr>
-          <w:color w:val="444A52"/>
+          <w:color w:val="1F1F1F"/>
           <w:sz w:val="21"/>
         </w:rPr>
         <w:t>Apply approved marine anti-corrosion coating system.</w:t>
@@ -2933,7 +3093,7 @@
       </w:pPr>
       <w:r>
         <w:rPr>
-          <w:color w:val="444A52"/>
+          <w:color w:val="1F1F1F"/>
           <w:sz w:val="21"/>
         </w:rPr>
         <w:t>Repaint complete wave breaker structure.</w:t>
@@ -2947,19 +3107,10 @@
       <w:r>
         <w:rPr>
           <w:b/>
-          <w:color w:val="1C4E80"/>
+          <w:color w:val="26B8EF"/>
           <w:sz w:val="22"/>
         </w:rPr>
-        <w:t xml:space="preserve">9.2  </w:t>
-      </w:r>
-      <w:r>
-        <w:rPr>
-          <w:rFonts w:ascii="Calibri" w:hAnsi="Calibri"/>
-          <w:b/>
-          <w:color w:val="1C4E80"/>
-          <w:sz w:val="22"/>
-        </w:rPr>
-        <w:t>Navigation Poles</w:t>
+        <w:t>9.2  Navigation Poles</w:t>
       </w:r>
     </w:p>
     <w:p>
@@ -2970,7 +3121,7 @@
       </w:pPr>
       <w:r>
         <w:rPr>
-          <w:color w:val="444A52"/>
+          <w:color w:val="1F1F1F"/>
           <w:sz w:val="21"/>
         </w:rPr>
         <w:t>Remove corrosion.</w:t>
@@ -2984,7 +3135,7 @@
       </w:pPr>
       <w:r>
         <w:rPr>
-          <w:color w:val="444A52"/>
+          <w:color w:val="1F1F1F"/>
           <w:sz w:val="21"/>
         </w:rPr>
         <w:t>Repaint navigation poles.</w:t>
@@ -2998,7 +3149,7 @@
       </w:pPr>
       <w:r>
         <w:rPr>
-          <w:color w:val="444A52"/>
+          <w:color w:val="1F1F1F"/>
           <w:sz w:val="21"/>
         </w:rPr>
         <w:t>Replace heavily corroded foundation anchor bolts.</w:t>
@@ -3012,19 +3163,10 @@
       <w:r>
         <w:rPr>
           <w:b/>
-          <w:color w:val="1C4E80"/>
+          <w:color w:val="26B8EF"/>
           <w:sz w:val="22"/>
         </w:rPr>
-        <w:t xml:space="preserve">9.3  </w:t>
-      </w:r>
-      <w:r>
-        <w:rPr>
-          <w:rFonts w:ascii="Calibri" w:hAnsi="Calibri"/>
-          <w:b/>
-          <w:color w:val="1C4E80"/>
-          <w:sz w:val="22"/>
-        </w:rPr>
-        <w:t>Manhole Repair</w:t>
+        <w:t>9.3  Manhole Repair</w:t>
       </w:r>
     </w:p>
     <w:p>
@@ -3035,7 +3177,7 @@
       </w:pPr>
       <w:r>
         <w:rPr>
-          <w:color w:val="444A52"/>
+          <w:color w:val="1F1F1F"/>
           <w:sz w:val="21"/>
         </w:rPr>
         <w:t>Remove temporary plywood cover.</w:t>
@@ -3049,7 +3191,7 @@
       </w:pPr>
       <w:r>
         <w:rPr>
-          <w:color w:val="444A52"/>
+          <w:color w:val="1F1F1F"/>
           <w:sz w:val="21"/>
         </w:rPr>
         <w:t>Supply and install permanent marine-grade manhole cover.</w:t>
@@ -3063,43 +3205,70 @@
       </w:pPr>
       <w:r>
         <w:rPr>
-          <w:color w:val="444A52"/>
+          <w:color w:val="1F1F1F"/>
           <w:sz w:val="21"/>
         </w:rPr>
         <w:t>Reinstate surrounding area.</w:t>
       </w:r>
     </w:p>
+    <w:tbl>
+      <w:tblPr>
+        <w:tblW w:type="auto" w:w="0"/>
+        <w:jc w:val="center"/>
+        <w:tblLook w:firstColumn="1" w:firstRow="1" w:lastColumn="0" w:lastRow="0" w:noHBand="0" w:noVBand="1" w:val="04A0"/>
+        <w:tblBorders>
+          <w:top w:val="none"/>
+          <w:left w:val="none"/>
+          <w:bottom w:val="none"/>
+          <w:right w:val="none"/>
+          <w:insideH w:val="none"/>
+          <w:insideV w:val="none"/>
+        </w:tblBorders>
+      </w:tblPr>
+      <w:tblGrid>
+        <w:gridCol w:w="9972"/>
+      </w:tblGrid>
+      <w:tr>
+        <w:tc>
+          <w:tcPr>
+            <w:tcW w:type="dxa" w:w="9972"/>
+            <w:shd w:val="clear" w:color="auto" w:fill="111111"/>
+            <w:tcMar>
+              <w:top w:w="90" w:type="dxa"/>
+              <w:bottom w:w="90" w:type="dxa"/>
+              <w:start w:w="140" w:type="dxa"/>
+              <w:end w:w="120" w:type="dxa"/>
+            </w:tcMar>
+            <w:tcBorders>
+              <w:start w:val="single" w:sz="22" w:space="0" w:color="26B8EF"/>
+            </w:tcBorders>
+          </w:tcPr>
+          <w:p>
+            <w:r>
+              <w:rPr>
+                <w:rFonts w:ascii="Calibri" w:hAnsi="Calibri"/>
+                <w:b/>
+                <w:color w:val="FFFFFF"/>
+                <w:sz w:val="23"/>
+              </w:rPr>
+              <w:t>10.  QUAY WALL SURFACE REPAINTING</w:t>
+            </w:r>
+          </w:p>
+        </w:tc>
+      </w:tr>
+    </w:tbl>
     <w:p>
       <w:pPr>
-        <w:keepNext/>
-        <w:spacing w:before="320" w:after="120"/>
-        <w:pBdr>
-          <w:bottom w:val="single" w:sz="12" w:space="4" w:color="1C4E80"/>
-        </w:pBdr>
+        <w:spacing w:after="40"/>
+      </w:pPr>
+    </w:p>
+    <w:p>
+      <w:pPr>
+        <w:jc w:val="both"/>
       </w:pPr>
       <w:r>
         <w:rPr>
-          <w:rFonts w:ascii="Calibri" w:hAnsi="Calibri"/>
-          <w:b/>
-          <w:color w:val="0E7690"/>
-          <w:sz w:val="28"/>
-        </w:rPr>
-        <w:t xml:space="preserve">10.  </w:t>
-      </w:r>
-      <w:r>
-        <w:rPr>
-          <w:rFonts w:ascii="Calibri" w:hAnsi="Calibri"/>
-          <w:b/>
-          <w:color w:val="0B1F3A"/>
-          <w:sz w:val="27"/>
-        </w:rPr>
-        <w:t>QUAY WALL SURFACE REPAINTING</w:t>
-      </w:r>
-    </w:p>
-    <w:p>
-      <w:r>
-        <w:rPr>
-          <w:color w:val="444A52"/>
+          <w:color w:val="1F1F1F"/>
           <w:sz w:val="21"/>
         </w:rPr>
         <w:t>The Contractor shall:</w:t>
@@ -3113,7 +3282,7 @@
       </w:pPr>
       <w:r>
         <w:rPr>
-          <w:color w:val="444A52"/>
+          <w:color w:val="1F1F1F"/>
           <w:sz w:val="21"/>
         </w:rPr>
         <w:t>Prepare top surface of quay wall surrounding the marina basin.</w:t>
@@ -3127,7 +3296,7 @@
       </w:pPr>
       <w:r>
         <w:rPr>
-          <w:color w:val="444A52"/>
+          <w:color w:val="1F1F1F"/>
           <w:sz w:val="21"/>
         </w:rPr>
         <w:t>Remove deteriorated coatings.</w:t>
@@ -3141,7 +3310,7 @@
       </w:pPr>
       <w:r>
         <w:rPr>
-          <w:color w:val="444A52"/>
+          <w:color w:val="1F1F1F"/>
           <w:sz w:val="21"/>
         </w:rPr>
         <w:t>Apply approved marine coating system.</w:t>
@@ -3155,43 +3324,70 @@
       </w:pPr>
       <w:r>
         <w:rPr>
-          <w:color w:val="444A52"/>
+          <w:color w:val="1F1F1F"/>
           <w:sz w:val="21"/>
         </w:rPr>
         <w:t>Repaint quay wall top surfaces only.</w:t>
       </w:r>
     </w:p>
+    <w:tbl>
+      <w:tblPr>
+        <w:tblW w:type="auto" w:w="0"/>
+        <w:jc w:val="center"/>
+        <w:tblLook w:firstColumn="1" w:firstRow="1" w:lastColumn="0" w:lastRow="0" w:noHBand="0" w:noVBand="1" w:val="04A0"/>
+        <w:tblBorders>
+          <w:top w:val="none"/>
+          <w:left w:val="none"/>
+          <w:bottom w:val="none"/>
+          <w:right w:val="none"/>
+          <w:insideH w:val="none"/>
+          <w:insideV w:val="none"/>
+        </w:tblBorders>
+      </w:tblPr>
+      <w:tblGrid>
+        <w:gridCol w:w="9972"/>
+      </w:tblGrid>
+      <w:tr>
+        <w:tc>
+          <w:tcPr>
+            <w:tcW w:type="dxa" w:w="9972"/>
+            <w:shd w:val="clear" w:color="auto" w:fill="111111"/>
+            <w:tcMar>
+              <w:top w:w="90" w:type="dxa"/>
+              <w:bottom w:w="90" w:type="dxa"/>
+              <w:start w:w="140" w:type="dxa"/>
+              <w:end w:w="120" w:type="dxa"/>
+            </w:tcMar>
+            <w:tcBorders>
+              <w:start w:val="single" w:sz="22" w:space="0" w:color="26B8EF"/>
+            </w:tcBorders>
+          </w:tcPr>
+          <w:p>
+            <w:r>
+              <w:rPr>
+                <w:rFonts w:ascii="Calibri" w:hAnsi="Calibri"/>
+                <w:b/>
+                <w:color w:val="FFFFFF"/>
+                <w:sz w:val="23"/>
+              </w:rPr>
+              <w:t>11.  SLIPWAY PONTOON STRUCTURAL REPAIRS</w:t>
+            </w:r>
+          </w:p>
+        </w:tc>
+      </w:tr>
+    </w:tbl>
     <w:p>
       <w:pPr>
-        <w:keepNext/>
-        <w:spacing w:before="320" w:after="120"/>
-        <w:pBdr>
-          <w:bottom w:val="single" w:sz="12" w:space="4" w:color="1C4E80"/>
-        </w:pBdr>
+        <w:spacing w:after="40"/>
+      </w:pPr>
+    </w:p>
+    <w:p>
+      <w:pPr>
+        <w:jc w:val="both"/>
       </w:pPr>
       <w:r>
         <w:rPr>
-          <w:rFonts w:ascii="Calibri" w:hAnsi="Calibri"/>
-          <w:b/>
-          <w:color w:val="0E7690"/>
-          <w:sz w:val="28"/>
-        </w:rPr>
-        <w:t xml:space="preserve">11.  </w:t>
-      </w:r>
-      <w:r>
-        <w:rPr>
-          <w:rFonts w:ascii="Calibri" w:hAnsi="Calibri"/>
-          <w:b/>
-          <w:color w:val="0B1F3A"/>
-          <w:sz w:val="27"/>
-        </w:rPr>
-        <w:t>SLIPWAY PONTOON STRUCTURAL REPAIRS</w:t>
-      </w:r>
-    </w:p>
-    <w:p>
-      <w:r>
-        <w:rPr>
-          <w:color w:val="444A52"/>
+          <w:color w:val="1F1F1F"/>
           <w:sz w:val="21"/>
         </w:rPr>
         <w:t>The Contractor shall:</w:t>
@@ -3205,7 +3401,7 @@
       </w:pPr>
       <w:r>
         <w:rPr>
-          <w:color w:val="444A52"/>
+          <w:color w:val="1F1F1F"/>
           <w:sz w:val="21"/>
         </w:rPr>
         <w:t>Inspect and repair stainless steel H-beam attached to quay wall.</w:t>
@@ -3219,7 +3415,7 @@
       </w:pPr>
       <w:r>
         <w:rPr>
-          <w:color w:val="444A52"/>
+          <w:color w:val="1F1F1F"/>
           <w:sz w:val="21"/>
         </w:rPr>
         <w:t>Reinstall and secure foundation anchor bolts.</w:t>
@@ -3233,7 +3429,7 @@
       </w:pPr>
       <w:r>
         <w:rPr>
-          <w:color w:val="444A52"/>
+          <w:color w:val="1F1F1F"/>
           <w:sz w:val="21"/>
         </w:rPr>
         <w:t>Repair damaged / spalled concrete around foundation areas.</w:t>
@@ -3247,7 +3443,7 @@
       </w:pPr>
       <w:r>
         <w:rPr>
-          <w:color w:val="444A52"/>
+          <w:color w:val="1F1F1F"/>
           <w:sz w:val="21"/>
         </w:rPr>
         <w:t>Reinstate concrete using approved marine repair materials.</w:t>
@@ -3261,7 +3457,7 @@
       </w:pPr>
       <w:r>
         <w:rPr>
-          <w:color w:val="444A52"/>
+          <w:color w:val="1F1F1F"/>
           <w:sz w:val="21"/>
         </w:rPr>
         <w:t>Ensure structural integrity and long-term durability of the installation.</w:t>
@@ -3269,31 +3465,23 @@
     </w:p>
     <w:p>
       <w:pPr>
-        <w:spacing w:after="200" w:before="0"/>
-      </w:pPr>
-    </w:p>
-    <w:p>
-      <w:pPr>
-        <w:spacing w:before="160"/>
+        <w:spacing w:before="240"/>
         <w:jc w:val="center"/>
-        <w:pBdr>
-          <w:top w:val="single" w:sz="10" w:space="6" w:color="0E7690"/>
-        </w:pBdr>
       </w:pPr>
       <w:r>
         <w:rPr>
           <w:i/>
-          <w:color w:val="7A8694"/>
+          <w:color w:val="888888"/>
           <w:sz w:val="18"/>
         </w:rPr>
         <w:t>— End of Technical Submittal —</w:t>
       </w:r>
     </w:p>
     <w:sectPr>
-      <w:headerReference w:type="default" r:id="rId9"/>
-      <w:footerReference w:type="default" r:id="rId10"/>
+      <w:headerReference w:type="default" r:id="rId11"/>
+      <w:footerReference w:type="default" r:id="rId12"/>
       <w:pgSz w:w="12240" w:h="15840"/>
-      <w:pgMar w:top="1247" w:right="1247" w:bottom="1134" w:left="1247" w:header="624" w:footer="624" w:gutter="0"/>
+      <w:pgMar w:top="1644" w:right="1134" w:bottom="1247" w:left="1134" w:header="227" w:footer="227" w:gutter="0"/>
       <w:cols w:space="720"/>
       <w:docGrid w:linePitch="360"/>
     </w:sectPr>
@@ -3306,76 +3494,148 @@
   <w:p>
     <w:pPr>
       <w:pStyle w:val="Footer"/>
-      <w:pBdr>
-        <w:top w:val="single" w:sz="8" w:space="4" w:color="D5DEE7"/>
-      </w:pBdr>
-      <w:spacing w:after="40"/>
+      <w:spacing w:after="20"/>
+      <w:jc w:val="center"/>
     </w:pPr>
+    <w:r>
+      <w:rPr>
+        <w:color w:val="888888"/>
+        <w:sz w:val="15"/>
+      </w:rPr>
+      <w:t xml:space="preserve">Page </w:t>
+    </w:r>
+    <w:r>
+      <w:rPr>
+        <w:color w:val="888888"/>
+        <w:sz w:val="16"/>
+      </w:rPr>
+      <w:fldChar w:fldCharType="begin"/>
+      <w:instrText xml:space="preserve">PAGE</w:instrText>
+      <w:fldChar w:fldCharType="end"/>
+    </w:r>
+    <w:r>
+      <w:rPr>
+        <w:color w:val="888888"/>
+        <w:sz w:val="15"/>
+      </w:rPr>
+      <w:t xml:space="preserve">  |  TS-SL-260629  |  Rev A – For Design Review  |  Confidential</w:t>
+    </w:r>
   </w:p>
-  <w:tbl>
-    <w:tblPr>
-      <w:tblW w:type="auto" w:w="0"/>
-      <w:tblLook w:firstColumn="1" w:firstRow="1" w:lastColumn="0" w:lastRow="0" w:noHBand="0" w:noVBand="1" w:val="04A0"/>
-      <w:tblBorders>
-        <w:top w:val="none"/>
-        <w:left w:val="none"/>
-        <w:bottom w:val="none"/>
-        <w:right w:val="none"/>
-        <w:insideH w:val="none"/>
-        <w:insideV w:val="none"/>
-      </w:tblBorders>
-    </w:tblPr>
-    <w:tblGrid>
-      <w:gridCol w:w="4680"/>
-      <w:gridCol w:w="4680"/>
-    </w:tblGrid>
-    <w:tr>
-      <w:tc>
-        <w:tcPr>
-          <w:tcW w:type="dxa" w:w="4680"/>
-        </w:tcPr>
-        <w:p>
-          <w:pPr>
-            <w:jc w:val="left"/>
-          </w:pPr>
-          <w:r>
-            <w:rPr>
-              <w:rFonts w:ascii="Calibri" w:hAnsi="Calibri"/>
-              <w:color w:val="7A8694"/>
-              <w:sz w:val="15"/>
-            </w:rPr>
-            <w:t>Technical Submittal  |  Marina Infrastructure Maintenance &amp; Rehabilitation Works</w:t>
-          </w:r>
-        </w:p>
-      </w:tc>
-      <w:tc>
-        <w:tcPr>
-          <w:tcW w:type="dxa" w:w="4680"/>
-        </w:tcPr>
-        <w:p>
-          <w:pPr>
-            <w:jc w:val="right"/>
-          </w:pPr>
-          <w:r>
-            <w:rPr>
-              <w:color w:val="7A8694"/>
-              <w:sz w:val="16"/>
-            </w:rPr>
-            <w:t xml:space="preserve">Page </w:t>
-          </w:r>
-          <w:r>
-            <w:rPr>
-              <w:color w:val="7A8694"/>
-              <w:sz w:val="16"/>
-            </w:rPr>
-            <w:fldChar w:fldCharType="begin"/>
-            <w:instrText xml:space="preserve">PAGE</w:instrText>
-            <w:fldChar w:fldCharType="end"/>
-          </w:r>
-        </w:p>
-      </w:tc>
-    </w:tr>
-  </w:tbl>
+  <w:p>
+    <w:pPr>
+      <w:spacing w:after="0" w:before="0"/>
+      <w:jc w:val="center"/>
+    </w:pPr>
+    <w:r>
+      <w:drawing>
+        <wp:inline xmlns:a="http://schemas.openxmlformats.org/drawingml/2006/main" xmlns:pic="http://schemas.openxmlformats.org/drawingml/2006/picture">
+          <wp:extent cx="7560000" cy="429649"/>
+          <wp:docPr id="1" name="Picture 1"/>
+          <wp:cNvGraphicFramePr>
+            <a:graphicFrameLocks noChangeAspect="1"/>
+          </wp:cNvGraphicFramePr>
+          <a:graphic>
+            <a:graphicData uri="http://schemas.openxmlformats.org/drawingml/2006/picture">
+              <pic:pic>
+                <pic:nvPicPr>
+                  <pic:cNvPr id="0" name="crop_footer.png"/>
+                  <pic:cNvPicPr/>
+                </pic:nvPicPr>
+                <pic:blipFill>
+                  <a:blip r:embed="rId1"/>
+                  <a:stretch>
+                    <a:fillRect/>
+                  </a:stretch>
+                </pic:blipFill>
+                <pic:spPr>
+                  <a:xfrm>
+                    <a:off x="0" y="0"/>
+                    <a:ext cx="7560000" cy="429649"/>
+                  </a:xfrm>
+                  <a:prstGeom prst="rect"/>
+                </pic:spPr>
+              </pic:pic>
+            </a:graphicData>
+          </a:graphic>
+        </wp:inline>
+      </w:drawing>
+    </w:r>
+  </w:p>
+</w:ftr>
+</file>
+
+<file path=word/footer2.xml><?xml version="1.0" encoding="utf-8"?>
+<w:ftr xmlns:m="http://schemas.openxmlformats.org/officeDocument/2006/math" xmlns:mc="http://schemas.openxmlformats.org/markup-compatibility/2006" xmlns:mo="http://schemas.microsoft.com/office/mac/office/2008/main" xmlns:mv="urn:schemas-microsoft-com:mac:vml" xmlns:o="urn:schemas-microsoft-com:office:office" xmlns:r="http://schemas.openxmlformats.org/officeDocument/2006/relationships" xmlns:v="urn:schemas-microsoft-com:vml" xmlns:w10="urn:schemas-microsoft-com:office:word" xmlns:w14="http://schemas.microsoft.com/office/word/2010/wordml" xmlns:w="http://schemas.openxmlformats.org/wordprocessingml/2006/main" xmlns:wne="http://schemas.microsoft.com/office/word/2006/wordml" xmlns:wp14="http://schemas.microsoft.com/office/word/2010/wordprocessingDrawing" xmlns:wp="http://schemas.openxmlformats.org/drawingml/2006/wordprocessingDrawing" xmlns:wpc="http://schemas.microsoft.com/office/word/2010/wordprocessingCanvas" xmlns:wpg="http://schemas.microsoft.com/office/word/2010/wordprocessingGroup" xmlns:wpi="http://schemas.microsoft.com/office/word/2010/wordprocessingInk" xmlns:wps="http://schemas.microsoft.com/office/word/2010/wordprocessingShape" mc:Ignorable="w14 wp14">
+  <w:p>
+    <w:pPr>
+      <w:pStyle w:val="Footer"/>
+      <w:spacing w:after="20"/>
+      <w:jc w:val="center"/>
+    </w:pPr>
+    <w:r>
+      <w:rPr>
+        <w:color w:val="888888"/>
+        <w:sz w:val="15"/>
+      </w:rPr>
+      <w:t xml:space="preserve">Page </w:t>
+    </w:r>
+    <w:r>
+      <w:rPr>
+        <w:color w:val="888888"/>
+        <w:sz w:val="16"/>
+      </w:rPr>
+      <w:fldChar w:fldCharType="begin"/>
+      <w:instrText xml:space="preserve">PAGE</w:instrText>
+      <w:fldChar w:fldCharType="end"/>
+    </w:r>
+    <w:r>
+      <w:rPr>
+        <w:color w:val="888888"/>
+        <w:sz w:val="15"/>
+      </w:rPr>
+      <w:t xml:space="preserve">  |  TS-SL-260629  |  Rev A – For Design Review  |  Confidential</w:t>
+    </w:r>
+  </w:p>
+  <w:p>
+    <w:pPr>
+      <w:spacing w:after="0" w:before="0"/>
+      <w:jc w:val="center"/>
+    </w:pPr>
+    <w:r>
+      <w:drawing>
+        <wp:inline xmlns:a="http://schemas.openxmlformats.org/drawingml/2006/main" xmlns:pic="http://schemas.openxmlformats.org/drawingml/2006/picture">
+          <wp:extent cx="7560000" cy="429649"/>
+          <wp:docPr id="1" name="Picture 1"/>
+          <wp:cNvGraphicFramePr>
+            <a:graphicFrameLocks noChangeAspect="1"/>
+          </wp:cNvGraphicFramePr>
+          <a:graphic>
+            <a:graphicData uri="http://schemas.openxmlformats.org/drawingml/2006/picture">
+              <pic:pic>
+                <pic:nvPicPr>
+                  <pic:cNvPr id="0" name="crop_footer.png"/>
+                  <pic:cNvPicPr/>
+                </pic:nvPicPr>
+                <pic:blipFill>
+                  <a:blip r:embed="rId1"/>
+                  <a:stretch>
+                    <a:fillRect/>
+                  </a:stretch>
+                </pic:blipFill>
+                <pic:spPr>
+                  <a:xfrm>
+                    <a:off x="0" y="0"/>
+                    <a:ext cx="7560000" cy="429649"/>
+                  </a:xfrm>
+                  <a:prstGeom prst="rect"/>
+                </pic:spPr>
+              </pic:pic>
+            </a:graphicData>
+          </a:graphic>
+        </wp:inline>
+      </w:drawing>
+    </w:r>
+  </w:p>
 </w:ftr>
 </file>
 
@@ -3384,90 +3644,103 @@
   <w:p>
     <w:pPr>
       <w:pStyle w:val="Header"/>
+      <w:spacing w:after="40" w:before="0"/>
+      <w:jc w:val="center"/>
     </w:pPr>
+    <w:r>
+      <w:drawing>
+        <wp:inline xmlns:a="http://schemas.openxmlformats.org/drawingml/2006/main" xmlns:pic="http://schemas.openxmlformats.org/drawingml/2006/picture">
+          <wp:extent cx="7560000" cy="981185"/>
+          <wp:docPr id="1" name="Picture 1"/>
+          <wp:cNvGraphicFramePr>
+            <a:graphicFrameLocks noChangeAspect="1"/>
+          </wp:cNvGraphicFramePr>
+          <a:graphic>
+            <a:graphicData uri="http://schemas.openxmlformats.org/drawingml/2006/picture">
+              <pic:pic>
+                <pic:nvPicPr>
+                  <pic:cNvPr id="0" name="crop_header.png"/>
+                  <pic:cNvPicPr/>
+                </pic:nvPicPr>
+                <pic:blipFill>
+                  <a:blip r:embed="rId1"/>
+                  <a:stretch>
+                    <a:fillRect/>
+                  </a:stretch>
+                </pic:blipFill>
+                <pic:spPr>
+                  <a:xfrm>
+                    <a:off x="0" y="0"/>
+                    <a:ext cx="7560000" cy="981185"/>
+                  </a:xfrm>
+                  <a:prstGeom prst="rect"/>
+                </pic:spPr>
+              </pic:pic>
+            </a:graphicData>
+          </a:graphic>
+        </wp:inline>
+      </w:drawing>
+    </w:r>
   </w:p>
-  <w:tbl>
-    <w:tblPr>
-      <w:tblW w:type="auto" w:w="0"/>
-      <w:tblLayout w:type="autofit"/>
-      <w:tblLook w:firstColumn="1" w:firstRow="1" w:lastColumn="0" w:lastRow="0" w:noHBand="0" w:noVBand="1" w:val="04A0"/>
-      <w:tblBorders>
-        <w:top w:val="none"/>
-        <w:left w:val="none"/>
-        <w:bottom w:val="none"/>
-        <w:right w:val="none"/>
-        <w:insideH w:val="none"/>
-        <w:insideV w:val="none"/>
-      </w:tblBorders>
-    </w:tblPr>
-    <w:tblGrid>
-      <w:gridCol w:w="4680"/>
-      <w:gridCol w:w="4680"/>
-    </w:tblGrid>
-    <w:tr>
-      <w:tc>
-        <w:tcPr>
-          <w:tcW w:type="dxa" w:w="4680"/>
-        </w:tcPr>
-        <w:p>
-          <w:pPr>
-            <w:jc w:val="left"/>
-          </w:pPr>
-          <w:r>
-            <w:rPr>
-              <w:rFonts w:ascii="Calibri" w:hAnsi="Calibri"/>
-              <w:b/>
-              <w:color w:val="0B1F3A"/>
-              <w:sz w:val="30"/>
-            </w:rPr>
-            <w:t>SELA</w:t>
-          </w:r>
-          <w:r>
-            <w:rPr>
-              <w:rFonts w:ascii="Calibri" w:hAnsi="Calibri"/>
-              <w:color w:val="7A8694"/>
-              <w:sz w:val="13"/>
-            </w:rPr>
-            <w:br/>
-            <w:t>Client / Consultant</w:t>
-          </w:r>
-        </w:p>
-      </w:tc>
-      <w:tc>
-        <w:tcPr>
-          <w:tcW w:type="dxa" w:w="4680"/>
-        </w:tcPr>
-        <w:p>
-          <w:pPr>
-            <w:jc w:val="right"/>
-          </w:pPr>
-          <w:r>
-            <w:rPr>
-              <w:rFonts w:ascii="Calibri" w:hAnsi="Calibri"/>
-              <w:b/>
-              <w:color w:val="1C4E80"/>
-              <w:sz w:val="30"/>
-            </w:rPr>
-            <w:t>SKYLANCE</w:t>
-          </w:r>
-          <w:r>
-            <w:rPr>
-              <w:rFonts w:ascii="Calibri" w:hAnsi="Calibri"/>
-              <w:color w:val="7A8694"/>
-              <w:sz w:val="13"/>
-            </w:rPr>
-            <w:br/>
-            <w:t>Marine Infrastructure Contractor</w:t>
-          </w:r>
-        </w:p>
-      </w:tc>
-    </w:tr>
-  </w:tbl>
   <w:p>
     <w:pPr>
       <w:spacing w:before="40" w:after="0"/>
       <w:pBdr>
-        <w:bottom w:val="single" w:sz="14" w:space="1" w:color="1C4E80"/>
+        <w:bottom w:val="single" w:sz="12" w:space="1" w:color="26B8EF"/>
+      </w:pBdr>
+    </w:pPr>
+  </w:p>
+</w:hdr>
+</file>
+
+<file path=word/header2.xml><?xml version="1.0" encoding="utf-8"?>
+<w:hdr xmlns:m="http://schemas.openxmlformats.org/officeDocument/2006/math" xmlns:mc="http://schemas.openxmlformats.org/markup-compatibility/2006" xmlns:mo="http://schemas.microsoft.com/office/mac/office/2008/main" xmlns:mv="urn:schemas-microsoft-com:mac:vml" xmlns:o="urn:schemas-microsoft-com:office:office" xmlns:r="http://schemas.openxmlformats.org/officeDocument/2006/relationships" xmlns:v="urn:schemas-microsoft-com:vml" xmlns:w10="urn:schemas-microsoft-com:office:word" xmlns:w14="http://schemas.microsoft.com/office/word/2010/wordml" xmlns:w="http://schemas.openxmlformats.org/wordprocessingml/2006/main" xmlns:wne="http://schemas.microsoft.com/office/word/2006/wordml" xmlns:wp14="http://schemas.microsoft.com/office/word/2010/wordprocessingDrawing" xmlns:wp="http://schemas.openxmlformats.org/drawingml/2006/wordprocessingDrawing" xmlns:wpc="http://schemas.microsoft.com/office/word/2010/wordprocessingCanvas" xmlns:wpg="http://schemas.microsoft.com/office/word/2010/wordprocessingGroup" xmlns:wpi="http://schemas.microsoft.com/office/word/2010/wordprocessingInk" xmlns:wps="http://schemas.microsoft.com/office/word/2010/wordprocessingShape" mc:Ignorable="w14 wp14">
+  <w:p>
+    <w:pPr>
+      <w:pStyle w:val="Header"/>
+      <w:spacing w:after="40" w:before="0"/>
+      <w:jc w:val="center"/>
+    </w:pPr>
+    <w:r>
+      <w:drawing>
+        <wp:inline xmlns:a="http://schemas.openxmlformats.org/drawingml/2006/main" xmlns:pic="http://schemas.openxmlformats.org/drawingml/2006/picture">
+          <wp:extent cx="7560000" cy="981185"/>
+          <wp:docPr id="1" name="Picture 1"/>
+          <wp:cNvGraphicFramePr>
+            <a:graphicFrameLocks noChangeAspect="1"/>
+          </wp:cNvGraphicFramePr>
+          <a:graphic>
+            <a:graphicData uri="http://schemas.openxmlformats.org/drawingml/2006/picture">
+              <pic:pic>
+                <pic:nvPicPr>
+                  <pic:cNvPr id="0" name="crop_header.png"/>
+                  <pic:cNvPicPr/>
+                </pic:nvPicPr>
+                <pic:blipFill>
+                  <a:blip r:embed="rId1"/>
+                  <a:stretch>
+                    <a:fillRect/>
+                  </a:stretch>
+                </pic:blipFill>
+                <pic:spPr>
+                  <a:xfrm>
+                    <a:off x="0" y="0"/>
+                    <a:ext cx="7560000" cy="981185"/>
+                  </a:xfrm>
+                  <a:prstGeom prst="rect"/>
+                </pic:spPr>
+              </pic:pic>
+            </a:graphicData>
+          </a:graphic>
+        </wp:inline>
+      </w:drawing>
+    </w:r>
+  </w:p>
+  <w:p>
+    <w:pPr>
+      <w:spacing w:before="40" w:after="0"/>
+      <w:pBdr>
+        <w:bottom w:val="single" w:sz="12" w:space="1" w:color="26B8EF"/>
       </w:pBdr>
     </w:pPr>
   </w:p>
@@ -3838,11 +4111,11 @@
     <w:qFormat/>
     <w:rsid w:val="00FC693F"/>
     <w:pPr>
-      <w:spacing w:lineRule="auto" w:line="269" w:after="120"/>
+      <w:spacing w:line="269" w:lineRule="auto" w:after="120"/>
     </w:pPr>
     <w:rPr>
       <w:rFonts w:ascii="Calibri" w:hAnsi="Calibri"/>
-      <w:color w:val="444A52"/>
+      <w:color w:val="1F1F1F"/>
       <w:sz w:val="21"/>
     </w:rPr>
   </w:style>

</xml_diff>

<commit_message>
Add co-branded header with official SELA logo (Contractor + Client)
- Use the official SELA logo provided by the client (extracted and
  recoloured to a clean black-on-transparent and white variants)
- Build a unified co-branded header band: Skylance logo + CR (left),
  SELA logo (right), with CONTRACTOR and CLIENT labels and cyan rule
- Both PDF and DOCX now use the same header image for an identical look

Co-Authored-By: Claude Opus 4.8 <noreply@anthropic.com>
Claude-Session: https://claude.ai/code/session_01EiMwn8BvQ56Xm8AUc8ARZ9
</commit_message>
<xml_diff>
--- a/Technical Submittal - JYC Marina Infrastructure (Skylance).docx
+++ b/Technical Submittal - JYC Marina Infrastructure (Skylance).docx
@@ -3650,7 +3650,7 @@
     <w:r>
       <w:drawing>
         <wp:inline xmlns:a="http://schemas.openxmlformats.org/drawingml/2006/main" xmlns:pic="http://schemas.openxmlformats.org/drawingml/2006/picture">
-          <wp:extent cx="7560000" cy="981185"/>
+          <wp:extent cx="7560000" cy="1346844"/>
           <wp:docPr id="1" name="Picture 1"/>
           <wp:cNvGraphicFramePr>
             <a:graphicFrameLocks noChangeAspect="1"/>
@@ -3659,7 +3659,7 @@
             <a:graphicData uri="http://schemas.openxmlformats.org/drawingml/2006/picture">
               <pic:pic>
                 <pic:nvPicPr>
-                  <pic:cNvPr id="0" name="crop_header.png"/>
+                  <pic:cNvPr id="0" name="header_cobrand.png"/>
                   <pic:cNvPicPr/>
                 </pic:nvPicPr>
                 <pic:blipFill>
@@ -3671,7 +3671,7 @@
                 <pic:spPr>
                   <a:xfrm>
                     <a:off x="0" y="0"/>
-                    <a:ext cx="7560000" cy="981185"/>
+                    <a:ext cx="7560000" cy="1346844"/>
                   </a:xfrm>
                   <a:prstGeom prst="rect"/>
                 </pic:spPr>
@@ -3681,14 +3681,6 @@
         </wp:inline>
       </w:drawing>
     </w:r>
-  </w:p>
-  <w:p>
-    <w:pPr>
-      <w:spacing w:before="40" w:after="0"/>
-      <w:pBdr>
-        <w:bottom w:val="single" w:sz="12" w:space="1" w:color="26B8EF"/>
-      </w:pBdr>
-    </w:pPr>
   </w:p>
 </w:hdr>
 </file>
@@ -3704,7 +3696,7 @@
     <w:r>
       <w:drawing>
         <wp:inline xmlns:a="http://schemas.openxmlformats.org/drawingml/2006/main" xmlns:pic="http://schemas.openxmlformats.org/drawingml/2006/picture">
-          <wp:extent cx="7560000" cy="981185"/>
+          <wp:extent cx="7560000" cy="1346844"/>
           <wp:docPr id="1" name="Picture 1"/>
           <wp:cNvGraphicFramePr>
             <a:graphicFrameLocks noChangeAspect="1"/>
@@ -3713,7 +3705,7 @@
             <a:graphicData uri="http://schemas.openxmlformats.org/drawingml/2006/picture">
               <pic:pic>
                 <pic:nvPicPr>
-                  <pic:cNvPr id="0" name="crop_header.png"/>
+                  <pic:cNvPr id="0" name="header_cobrand.png"/>
                   <pic:cNvPicPr/>
                 </pic:nvPicPr>
                 <pic:blipFill>
@@ -3725,7 +3717,7 @@
                 <pic:spPr>
                   <a:xfrm>
                     <a:off x="0" y="0"/>
-                    <a:ext cx="7560000" cy="981185"/>
+                    <a:ext cx="7560000" cy="1346844"/>
                   </a:xfrm>
                   <a:prstGeom prst="rect"/>
                 </pic:spPr>
@@ -3735,14 +3727,6 @@
         </wp:inline>
       </w:drawing>
     </w:r>
-  </w:p>
-  <w:p>
-    <w:pPr>
-      <w:spacing w:before="40" w:after="0"/>
-      <w:pBdr>
-        <w:bottom w:val="single" w:sz="12" w:space="1" w:color="26B8EF"/>
-      </w:pBdr>
-    </w:pPr>
   </w:p>
 </w:hdr>
 </file>

</xml_diff>

<commit_message>
Cover page: standalone Skylance + SELA logo lockup on white space
- Extract a standalone Skylance logo (triangle + wordmark) for use
  on light backgrounds
- Cover page now shows Skylance and SELA logos side by side in the
  white space (Contractor / Client), with the black co-branded band
  removed from the cover only
- Content pages keep the co-branded running header band
- Applied to both PDF and DOCX

Co-Authored-By: Claude Opus 4.8 <noreply@anthropic.com>
Claude-Session: https://claude.ai/code/session_01EiMwn8BvQ56Xm8AUc8ARZ9
</commit_message>
<xml_diff>
--- a/Technical Submittal - JYC Marina Infrastructure (Skylance).docx
+++ b/Technical Submittal - JYC Marina Infrastructure (Skylance).docx
@@ -2,6 +2,208 @@
 <file path=word/document.xml><?xml version="1.0" encoding="utf-8"?>
 <w:document xmlns:wpc="http://schemas.microsoft.com/office/word/2010/wordprocessingCanvas" xmlns:mo="http://schemas.microsoft.com/office/mac/office/2008/main" xmlns:mc="http://schemas.openxmlformats.org/markup-compatibility/2006" xmlns:mv="urn:schemas-microsoft-com:mac:vml" xmlns:o="urn:schemas-microsoft-com:office:office" xmlns:r="http://schemas.openxmlformats.org/officeDocument/2006/relationships" xmlns:m="http://schemas.openxmlformats.org/officeDocument/2006/math" xmlns:v="urn:schemas-microsoft-com:vml" xmlns:wp14="http://schemas.microsoft.com/office/word/2010/wordprocessingDrawing" xmlns:wp="http://schemas.openxmlformats.org/drawingml/2006/wordprocessingDrawing" xmlns:w10="urn:schemas-microsoft-com:office:word" xmlns:w="http://schemas.openxmlformats.org/wordprocessingml/2006/main" xmlns:w14="http://schemas.microsoft.com/office/word/2010/wordml" xmlns:wpg="http://schemas.microsoft.com/office/word/2010/wordprocessingGroup" xmlns:wpi="http://schemas.microsoft.com/office/word/2010/wordprocessingInk" xmlns:wne="http://schemas.microsoft.com/office/word/2006/wordml" xmlns:wps="http://schemas.microsoft.com/office/word/2010/wordprocessingShape" mc:Ignorable="w14 wp14">
   <w:body>
+    <w:tbl>
+      <w:tblPr>
+        <w:tblW w:type="auto" w:w="0"/>
+        <w:jc w:val="center"/>
+        <w:tblLook w:firstColumn="1" w:firstRow="1" w:lastColumn="0" w:lastRow="0" w:noHBand="0" w:noVBand="1" w:val="04A0"/>
+        <w:tblBorders>
+          <w:top w:val="none"/>
+          <w:left w:val="none"/>
+          <w:bottom w:val="none"/>
+          <w:right w:val="none"/>
+          <w:insideH w:val="none"/>
+          <w:insideV w:val="none"/>
+        </w:tblBorders>
+      </w:tblPr>
+      <w:tblGrid>
+        <w:gridCol w:w="3324"/>
+        <w:gridCol w:w="3324"/>
+        <w:gridCol w:w="3324"/>
+      </w:tblGrid>
+      <w:tr>
+        <w:tc>
+          <w:tcPr>
+            <w:tcW w:type="dxa" w:w="3402"/>
+            <w:vAlign w:val="center"/>
+            <w:tcBorders>
+              <w:end w:val="single" w:sz="6" w:space="0" w:color="CFCFCF"/>
+            </w:tcBorders>
+          </w:tcPr>
+          <w:p>
+            <w:pPr>
+              <w:jc w:val="center"/>
+            </w:pPr>
+            <w:r>
+              <w:drawing>
+                <wp:inline xmlns:a="http://schemas.openxmlformats.org/drawingml/2006/main" xmlns:pic="http://schemas.openxmlformats.org/drawingml/2006/picture">
+                  <wp:extent cx="741429" cy="630000"/>
+                  <wp:docPr id="1" name="Picture 1"/>
+                  <wp:cNvGraphicFramePr>
+                    <a:graphicFrameLocks noChangeAspect="1"/>
+                  </wp:cNvGraphicFramePr>
+                  <a:graphic>
+                    <a:graphicData uri="http://schemas.openxmlformats.org/drawingml/2006/picture">
+                      <pic:pic>
+                        <pic:nvPicPr>
+                          <pic:cNvPr id="0" name="skylance_logo.png"/>
+                          <pic:cNvPicPr/>
+                        </pic:nvPicPr>
+                        <pic:blipFill>
+                          <a:blip r:embed="rId10"/>
+                          <a:stretch>
+                            <a:fillRect/>
+                          </a:stretch>
+                        </pic:blipFill>
+                        <pic:spPr>
+                          <a:xfrm>
+                            <a:off x="0" y="0"/>
+                            <a:ext cx="741429" cy="630000"/>
+                          </a:xfrm>
+                          <a:prstGeom prst="rect"/>
+                        </pic:spPr>
+                      </pic:pic>
+                    </a:graphicData>
+                  </a:graphic>
+                </wp:inline>
+              </w:drawing>
+            </w:r>
+          </w:p>
+        </w:tc>
+        <w:tc>
+          <w:tcPr>
+            <w:tcW w:type="dxa" w:w="567"/>
+            <w:vAlign w:val="center"/>
+          </w:tcPr>
+          <w:p/>
+        </w:tc>
+        <w:tc>
+          <w:tcPr>
+            <w:tcW w:type="dxa" w:w="3402"/>
+            <w:vAlign w:val="center"/>
+          </w:tcPr>
+          <w:p>
+            <w:pPr>
+              <w:jc w:val="center"/>
+            </w:pPr>
+            <w:r>
+              <w:drawing>
+                <wp:inline xmlns:a="http://schemas.openxmlformats.org/drawingml/2006/main" xmlns:pic="http://schemas.openxmlformats.org/drawingml/2006/picture">
+                  <wp:extent cx="851286" cy="280800"/>
+                  <wp:docPr id="2" name="Picture 2"/>
+                  <wp:cNvGraphicFramePr>
+                    <a:graphicFrameLocks noChangeAspect="1"/>
+                  </wp:cNvGraphicFramePr>
+                  <a:graphic>
+                    <a:graphicData uri="http://schemas.openxmlformats.org/drawingml/2006/picture">
+                      <pic:pic>
+                        <pic:nvPicPr>
+                          <pic:cNvPr id="0" name="sela_logo.png"/>
+                          <pic:cNvPicPr/>
+                        </pic:nvPicPr>
+                        <pic:blipFill>
+                          <a:blip r:embed="rId11"/>
+                          <a:stretch>
+                            <a:fillRect/>
+                          </a:stretch>
+                        </pic:blipFill>
+                        <pic:spPr>
+                          <a:xfrm>
+                            <a:off x="0" y="0"/>
+                            <a:ext cx="851286" cy="280800"/>
+                          </a:xfrm>
+                          <a:prstGeom prst="rect"/>
+                        </pic:spPr>
+                      </pic:pic>
+                    </a:graphicData>
+                  </a:graphic>
+                </wp:inline>
+              </w:drawing>
+            </w:r>
+          </w:p>
+        </w:tc>
+      </w:tr>
+      <w:tr>
+        <w:tc>
+          <w:tcPr>
+            <w:tcW w:type="dxa" w:w="3402"/>
+          </w:tcPr>
+          <w:p>
+            <w:pPr>
+              <w:spacing w:before="80"/>
+              <w:jc w:val="center"/>
+            </w:pPr>
+            <w:r>
+              <w:rPr>
+                <w:b/>
+                <w:color w:val="26B8EF"/>
+                <w:sz w:val="16"/>
+              </w:rPr>
+              <w:t>CONTRACTOR</w:t>
+            </w:r>
+            <w:r>
+              <w:rPr>
+                <w:color w:val="3A3A3A"/>
+                <w:sz w:val="15"/>
+              </w:rPr>
+              <w:br/>
+              <w:t>Skylance Technical Services Co.</w:t>
+            </w:r>
+          </w:p>
+        </w:tc>
+        <w:tc>
+          <w:tcPr>
+            <w:tcW w:type="dxa" w:w="567"/>
+          </w:tcPr>
+          <w:p/>
+        </w:tc>
+        <w:tc>
+          <w:tcPr>
+            <w:tcW w:type="dxa" w:w="3402"/>
+          </w:tcPr>
+          <w:p>
+            <w:pPr>
+              <w:spacing w:before="80"/>
+              <w:jc w:val="center"/>
+            </w:pPr>
+            <w:r>
+              <w:rPr>
+                <w:b/>
+                <w:color w:val="26B8EF"/>
+                <w:sz w:val="16"/>
+              </w:rPr>
+              <w:t>CLIENT</w:t>
+            </w:r>
+            <w:r>
+              <w:rPr>
+                <w:color w:val="3A3A3A"/>
+                <w:sz w:val="15"/>
+              </w:rPr>
+              <w:br/>
+              <w:t>Jeddah Yacht Club &amp; Marina</w:t>
+            </w:r>
+          </w:p>
+        </w:tc>
+      </w:tr>
+    </w:tbl>
+    <w:p>
+      <w:pPr>
+        <w:spacing w:after="40"/>
+      </w:pPr>
+    </w:p>
+    <w:p>
+      <w:pPr>
+        <w:spacing w:after="0"/>
+        <w:pBdr>
+          <w:bottom w:val="single" w:sz="14" w:space="4" w:color="26B8EF"/>
+        </w:pBdr>
+      </w:pPr>
+    </w:p>
+    <w:p>
+      <w:pPr>
+        <w:spacing w:after="200"/>
+      </w:pPr>
+    </w:p>
     <w:p>
       <w:pPr>
         <w:spacing w:after="200"/>
@@ -537,10 +739,9 @@
     <w:p>
       <w:pPr>
         <w:sectPr>
-          <w:headerReference w:type="default" r:id="rId9"/>
-          <w:footerReference w:type="default" r:id="rId10"/>
+          <w:footerReference w:type="default" r:id="rId9"/>
           <w:pgSz w:w="12240" w:h="15840"/>
-          <w:pgMar w:top="1644" w:right="1134" w:bottom="1247" w:left="1134" w:header="227" w:footer="227" w:gutter="0"/>
+          <w:pgMar w:top="850" w:right="1134" w:bottom="1247" w:left="1134" w:header="227" w:footer="227" w:gutter="0"/>
           <w:cols w:space="720"/>
           <w:docGrid w:linePitch="360"/>
         </w:sectPr>
@@ -3478,8 +3679,8 @@
       </w:r>
     </w:p>
     <w:sectPr>
-      <w:headerReference w:type="default" r:id="rId11"/>
-      <w:footerReference w:type="default" r:id="rId12"/>
+      <w:headerReference w:type="default" r:id="rId12"/>
+      <w:footerReference w:type="default" r:id="rId13"/>
       <w:pgSz w:w="12240" w:h="15840"/>
       <w:pgMar w:top="1644" w:right="1134" w:bottom="1247" w:left="1134" w:header="227" w:footer="227" w:gutter="0"/>
       <w:cols w:space="720"/>
@@ -3640,52 +3841,6 @@
 </file>
 
 <file path=word/header1.xml><?xml version="1.0" encoding="utf-8"?>
-<w:hdr xmlns:m="http://schemas.openxmlformats.org/officeDocument/2006/math" xmlns:mc="http://schemas.openxmlformats.org/markup-compatibility/2006" xmlns:mo="http://schemas.microsoft.com/office/mac/office/2008/main" xmlns:mv="urn:schemas-microsoft-com:mac:vml" xmlns:o="urn:schemas-microsoft-com:office:office" xmlns:r="http://schemas.openxmlformats.org/officeDocument/2006/relationships" xmlns:v="urn:schemas-microsoft-com:vml" xmlns:w10="urn:schemas-microsoft-com:office:word" xmlns:w14="http://schemas.microsoft.com/office/word/2010/wordml" xmlns:w="http://schemas.openxmlformats.org/wordprocessingml/2006/main" xmlns:wne="http://schemas.microsoft.com/office/word/2006/wordml" xmlns:wp14="http://schemas.microsoft.com/office/word/2010/wordprocessingDrawing" xmlns:wp="http://schemas.openxmlformats.org/drawingml/2006/wordprocessingDrawing" xmlns:wpc="http://schemas.microsoft.com/office/word/2010/wordprocessingCanvas" xmlns:wpg="http://schemas.microsoft.com/office/word/2010/wordprocessingGroup" xmlns:wpi="http://schemas.microsoft.com/office/word/2010/wordprocessingInk" xmlns:wps="http://schemas.microsoft.com/office/word/2010/wordprocessingShape" mc:Ignorable="w14 wp14">
-  <w:p>
-    <w:pPr>
-      <w:pStyle w:val="Header"/>
-      <w:spacing w:after="40" w:before="0"/>
-      <w:jc w:val="center"/>
-    </w:pPr>
-    <w:r>
-      <w:drawing>
-        <wp:inline xmlns:a="http://schemas.openxmlformats.org/drawingml/2006/main" xmlns:pic="http://schemas.openxmlformats.org/drawingml/2006/picture">
-          <wp:extent cx="7560000" cy="1346844"/>
-          <wp:docPr id="1" name="Picture 1"/>
-          <wp:cNvGraphicFramePr>
-            <a:graphicFrameLocks noChangeAspect="1"/>
-          </wp:cNvGraphicFramePr>
-          <a:graphic>
-            <a:graphicData uri="http://schemas.openxmlformats.org/drawingml/2006/picture">
-              <pic:pic>
-                <pic:nvPicPr>
-                  <pic:cNvPr id="0" name="header_cobrand.png"/>
-                  <pic:cNvPicPr/>
-                </pic:nvPicPr>
-                <pic:blipFill>
-                  <a:blip r:embed="rId1"/>
-                  <a:stretch>
-                    <a:fillRect/>
-                  </a:stretch>
-                </pic:blipFill>
-                <pic:spPr>
-                  <a:xfrm>
-                    <a:off x="0" y="0"/>
-                    <a:ext cx="7560000" cy="1346844"/>
-                  </a:xfrm>
-                  <a:prstGeom prst="rect"/>
-                </pic:spPr>
-              </pic:pic>
-            </a:graphicData>
-          </a:graphic>
-        </wp:inline>
-      </w:drawing>
-    </w:r>
-  </w:p>
-</w:hdr>
-</file>
-
-<file path=word/header2.xml><?xml version="1.0" encoding="utf-8"?>
 <w:hdr xmlns:m="http://schemas.openxmlformats.org/officeDocument/2006/math" xmlns:mc="http://schemas.openxmlformats.org/markup-compatibility/2006" xmlns:mo="http://schemas.microsoft.com/office/mac/office/2008/main" xmlns:mv="urn:schemas-microsoft-com:mac:vml" xmlns:o="urn:schemas-microsoft-com:office:office" xmlns:r="http://schemas.openxmlformats.org/officeDocument/2006/relationships" xmlns:v="urn:schemas-microsoft-com:vml" xmlns:w10="urn:schemas-microsoft-com:office:word" xmlns:w14="http://schemas.microsoft.com/office/word/2010/wordml" xmlns:w="http://schemas.openxmlformats.org/wordprocessingml/2006/main" xmlns:wne="http://schemas.microsoft.com/office/word/2006/wordml" xmlns:wp14="http://schemas.microsoft.com/office/word/2010/wordprocessingDrawing" xmlns:wp="http://schemas.openxmlformats.org/drawingml/2006/wordprocessingDrawing" xmlns:wpc="http://schemas.microsoft.com/office/word/2010/wordprocessingCanvas" xmlns:wpg="http://schemas.microsoft.com/office/word/2010/wordprocessingGroup" xmlns:wpi="http://schemas.microsoft.com/office/word/2010/wordprocessingInk" xmlns:wps="http://schemas.microsoft.com/office/word/2010/wordprocessingShape" mc:Ignorable="w14 wp14">
   <w:p>
     <w:pPr>

</xml_diff>

<commit_message>
Remove SELA logo from running header; keep Skylance house header
Content pages now use the clean Skylance header band (logo + CR +
cyan rule). Co-branding (Skylance + SELA, Contractor / Client)
remains on the cover lockup only. Applied to PDF and DOCX.

Co-Authored-By: Claude Opus 4.8 <noreply@anthropic.com>
Claude-Session: https://claude.ai/code/session_01EiMwn8BvQ56Xm8AUc8ARZ9
</commit_message>
<xml_diff>
--- a/Technical Submittal - JYC Marina Infrastructure (Skylance).docx
+++ b/Technical Submittal - JYC Marina Infrastructure (Skylance).docx
@@ -3851,7 +3851,7 @@
     <w:r>
       <w:drawing>
         <wp:inline xmlns:a="http://schemas.openxmlformats.org/drawingml/2006/main" xmlns:pic="http://schemas.openxmlformats.org/drawingml/2006/picture">
-          <wp:extent cx="7560000" cy="1346844"/>
+          <wp:extent cx="7560000" cy="981185"/>
           <wp:docPr id="1" name="Picture 1"/>
           <wp:cNvGraphicFramePr>
             <a:graphicFrameLocks noChangeAspect="1"/>
@@ -3860,7 +3860,7 @@
             <a:graphicData uri="http://schemas.openxmlformats.org/drawingml/2006/picture">
               <pic:pic>
                 <pic:nvPicPr>
-                  <pic:cNvPr id="0" name="header_cobrand.png"/>
+                  <pic:cNvPr id="0" name="crop_header.png"/>
                   <pic:cNvPicPr/>
                 </pic:nvPicPr>
                 <pic:blipFill>
@@ -3872,7 +3872,7 @@
                 <pic:spPr>
                   <a:xfrm>
                     <a:off x="0" y="0"/>
-                    <a:ext cx="7560000" cy="1346844"/>
+                    <a:ext cx="7560000" cy="981185"/>
                   </a:xfrm>
                   <a:prstGeom prst="rect"/>
                 </pic:spPr>
@@ -3882,6 +3882,14 @@
         </wp:inline>
       </w:drawing>
     </w:r>
+  </w:p>
+  <w:p>
+    <w:pPr>
+      <w:spacing w:before="40" w:after="0"/>
+      <w:pBdr>
+        <w:bottom w:val="single" w:sz="12" w:space="1" w:color="26B8EF"/>
+      </w:pBdr>
+    </w:pPr>
   </w:p>
 </w:hdr>
 </file>

</xml_diff>